<commit_message>
Update Lambda config Word export with latest changes + version history
Regenerates the docx to include the CDR record freshness check
(verifyLatestRecordIsAvailable), the CloudWatch Errors alarm / Datadog
wiring, and the latest selector set. Adds a Version Control section
(version, date, author, description, source commit) tracking the
document's revisions against the underlying git history.

Co-Authored-By: Claude Sonnet 5 <noreply@anthropic.com>
Claude-Session: https://claude.ai/code/session_01Q36wM6QGPasir3AQTij9Uf
</commit_message>
<xml_diff>
--- a/CdrDownloaderFunction-Lambda-Config.docx
+++ b/CdrDownloaderFunction-Lambda-Config.docx
@@ -62,6 +62,347 @@
         <w:spacing w:after="120" w:before="240"/>
       </w:pPr>
       <w:r>
+        <w:t xml:space="preserve">Version Control</w:t>
+      </w:r>
+    </w:p>
+    <w:tbl>
+      <w:tblPr>
+        <w:tblW w:type="dxa" w:w="10080"/>
+        <w:tblBorders>
+          <w:top w:val="single" w:color="auto" w:sz="4"/>
+          <w:left w:val="single" w:color="auto" w:sz="4"/>
+          <w:bottom w:val="single" w:color="auto" w:sz="4"/>
+          <w:right w:val="single" w:color="auto" w:sz="4"/>
+          <w:insideH w:val="single" w:color="auto" w:sz="4"/>
+          <w:insideV w:val="single" w:color="auto" w:sz="4"/>
+        </w:tblBorders>
+      </w:tblPr>
+      <w:tblGrid>
+        <w:gridCol w:w="1200"/>
+        <w:gridCol w:w="1600"/>
+        <w:gridCol w:w="2200"/>
+        <w:gridCol w:w="5080"/>
+      </w:tblGrid>
+      <w:tr>
+        <w:tc>
+          <w:tcPr>
+            <w:tcW w:type="dxa" w:w="1200"/>
+            <w:shd w:fill="2B5B84" w:color="auto" w:val="clear"/>
+            <w:tcMar>
+              <w:top w:type="dxa" w:w="80"/>
+              <w:left w:type="dxa" w:w="100"/>
+              <w:bottom w:type="dxa" w:w="80"/>
+              <w:right w:type="dxa" w:w="100"/>
+            </w:tcMar>
+            <w:vAlign w:val="center"/>
+          </w:tcPr>
+          <w:p>
+            <w:r>
+              <w:rPr>
+                <w:b/>
+                <w:bCs/>
+                <w:color w:val="FFFFFF"/>
+                <w:sz w:val="19"/>
+                <w:szCs w:val="19"/>
+              </w:rPr>
+              <w:t xml:space="preserve">Version</w:t>
+            </w:r>
+          </w:p>
+        </w:tc>
+        <w:tc>
+          <w:tcPr>
+            <w:tcW w:type="dxa" w:w="1600"/>
+            <w:shd w:fill="2B5B84" w:color="auto" w:val="clear"/>
+            <w:tcMar>
+              <w:top w:type="dxa" w:w="80"/>
+              <w:left w:type="dxa" w:w="100"/>
+              <w:bottom w:type="dxa" w:w="80"/>
+              <w:right w:type="dxa" w:w="100"/>
+            </w:tcMar>
+            <w:vAlign w:val="center"/>
+          </w:tcPr>
+          <w:p>
+            <w:r>
+              <w:rPr>
+                <w:b/>
+                <w:bCs/>
+                <w:color w:val="FFFFFF"/>
+                <w:sz w:val="19"/>
+                <w:szCs w:val="19"/>
+              </w:rPr>
+              <w:t xml:space="preserve">Date</w:t>
+            </w:r>
+          </w:p>
+        </w:tc>
+        <w:tc>
+          <w:tcPr>
+            <w:tcW w:type="dxa" w:w="2200"/>
+            <w:shd w:fill="2B5B84" w:color="auto" w:val="clear"/>
+            <w:tcMar>
+              <w:top w:type="dxa" w:w="80"/>
+              <w:left w:type="dxa" w:w="100"/>
+              <w:bottom w:type="dxa" w:w="80"/>
+              <w:right w:type="dxa" w:w="100"/>
+            </w:tcMar>
+            <w:vAlign w:val="center"/>
+          </w:tcPr>
+          <w:p>
+            <w:r>
+              <w:rPr>
+                <w:b/>
+                <w:bCs/>
+                <w:color w:val="FFFFFF"/>
+                <w:sz w:val="19"/>
+                <w:szCs w:val="19"/>
+              </w:rPr>
+              <w:t xml:space="preserve">Author</w:t>
+            </w:r>
+          </w:p>
+        </w:tc>
+        <w:tc>
+          <w:tcPr>
+            <w:tcW w:type="dxa" w:w="5080"/>
+            <w:shd w:fill="2B5B84" w:color="auto" w:val="clear"/>
+            <w:tcMar>
+              <w:top w:type="dxa" w:w="80"/>
+              <w:left w:type="dxa" w:w="100"/>
+              <w:bottom w:type="dxa" w:w="80"/>
+              <w:right w:type="dxa" w:w="100"/>
+            </w:tcMar>
+            <w:vAlign w:val="center"/>
+          </w:tcPr>
+          <w:p>
+            <w:r>
+              <w:rPr>
+                <w:b/>
+                <w:bCs/>
+                <w:color w:val="FFFFFF"/>
+                <w:sz w:val="19"/>
+                <w:szCs w:val="19"/>
+              </w:rPr>
+              <w:t xml:space="preserve">Description</w:t>
+            </w:r>
+          </w:p>
+        </w:tc>
+      </w:tr>
+      <w:tr>
+        <w:tc>
+          <w:tcPr>
+            <w:tcW w:type="dxa" w:w="1200"/>
+            <w:tcMar>
+              <w:top w:type="dxa" w:w="80"/>
+              <w:left w:type="dxa" w:w="100"/>
+              <w:bottom w:type="dxa" w:w="80"/>
+              <w:right w:type="dxa" w:w="100"/>
+            </w:tcMar>
+            <w:vAlign w:val="center"/>
+          </w:tcPr>
+          <w:p>
+            <w:r>
+              <w:rPr>
+                <w:b w:val="false"/>
+                <w:bCs w:val="false"/>
+                <w:color w:val="000000"/>
+                <w:sz w:val="19"/>
+                <w:szCs w:val="19"/>
+              </w:rPr>
+              <w:t xml:space="preserve">1.0</w:t>
+            </w:r>
+          </w:p>
+        </w:tc>
+        <w:tc>
+          <w:tcPr>
+            <w:tcW w:type="dxa" w:w="1600"/>
+            <w:tcMar>
+              <w:top w:type="dxa" w:w="80"/>
+              <w:left w:type="dxa" w:w="100"/>
+              <w:bottom w:type="dxa" w:w="80"/>
+              <w:right w:type="dxa" w:w="100"/>
+            </w:tcMar>
+            <w:vAlign w:val="center"/>
+          </w:tcPr>
+          <w:p>
+            <w:r>
+              <w:rPr>
+                <w:b w:val="false"/>
+                <w:bCs w:val="false"/>
+                <w:color w:val="000000"/>
+                <w:sz w:val="19"/>
+                <w:szCs w:val="19"/>
+              </w:rPr>
+              <w:t xml:space="preserve">2026-09-17</w:t>
+            </w:r>
+          </w:p>
+        </w:tc>
+        <w:tc>
+          <w:tcPr>
+            <w:tcW w:type="dxa" w:w="2200"/>
+            <w:tcMar>
+              <w:top w:type="dxa" w:w="80"/>
+              <w:left w:type="dxa" w:w="100"/>
+              <w:bottom w:type="dxa" w:w="80"/>
+              <w:right w:type="dxa" w:w="100"/>
+            </w:tcMar>
+            <w:vAlign w:val="center"/>
+          </w:tcPr>
+          <w:p>
+            <w:r>
+              <w:rPr>
+                <w:b w:val="false"/>
+                <w:bCs w:val="false"/>
+                <w:color w:val="000000"/>
+                <w:sz w:val="19"/>
+                <w:szCs w:val="19"/>
+              </w:rPr>
+              <w:t xml:space="preserve">Owen Idehen</w:t>
+            </w:r>
+          </w:p>
+        </w:tc>
+        <w:tc>
+          <w:tcPr>
+            <w:tcW w:type="dxa" w:w="5080"/>
+            <w:tcMar>
+              <w:top w:type="dxa" w:w="80"/>
+              <w:left w:type="dxa" w:w="100"/>
+              <w:bottom w:type="dxa" w:w="80"/>
+              <w:right w:type="dxa" w:w="100"/>
+            </w:tcMar>
+            <w:vAlign w:val="center"/>
+          </w:tcPr>
+          <w:p>
+            <w:r>
+              <w:rPr>
+                <w:b w:val="false"/>
+                <w:bCs w:val="false"/>
+                <w:color w:val="000000"/>
+                <w:sz w:val="19"/>
+                <w:szCs w:val="19"/>
+              </w:rPr>
+              <w:t xml:space="preserve">Initial export: Lambda configuration (template.yaml) and Node.js source (index.js, config.js, secrets.js, s3.js). Source commit 3287d72.</w:t>
+            </w:r>
+          </w:p>
+        </w:tc>
+      </w:tr>
+      <w:tr>
+        <w:tc>
+          <w:tcPr>
+            <w:tcW w:type="dxa" w:w="1200"/>
+            <w:tcMar>
+              <w:top w:type="dxa" w:w="80"/>
+              <w:left w:type="dxa" w:w="100"/>
+              <w:bottom w:type="dxa" w:w="80"/>
+              <w:right w:type="dxa" w:w="100"/>
+            </w:tcMar>
+            <w:vAlign w:val="center"/>
+          </w:tcPr>
+          <w:p>
+            <w:r>
+              <w:rPr>
+                <w:b w:val="false"/>
+                <w:bCs w:val="false"/>
+                <w:color w:val="000000"/>
+                <w:sz w:val="19"/>
+                <w:szCs w:val="19"/>
+              </w:rPr>
+              <w:t xml:space="preserve">1.1</w:t>
+            </w:r>
+          </w:p>
+        </w:tc>
+        <w:tc>
+          <w:tcPr>
+            <w:tcW w:type="dxa" w:w="1600"/>
+            <w:tcMar>
+              <w:top w:type="dxa" w:w="80"/>
+              <w:left w:type="dxa" w:w="100"/>
+              <w:bottom w:type="dxa" w:w="80"/>
+              <w:right w:type="dxa" w:w="100"/>
+            </w:tcMar>
+            <w:vAlign w:val="center"/>
+          </w:tcPr>
+          <w:p>
+            <w:r>
+              <w:rPr>
+                <w:b w:val="false"/>
+                <w:bCs w:val="false"/>
+                <w:color w:val="000000"/>
+                <w:sz w:val="19"/>
+                <w:szCs w:val="19"/>
+              </w:rPr>
+              <w:t xml:space="preserve">2026-09-17</w:t>
+            </w:r>
+          </w:p>
+        </w:tc>
+        <w:tc>
+          <w:tcPr>
+            <w:tcW w:type="dxa" w:w="2200"/>
+            <w:tcMar>
+              <w:top w:type="dxa" w:w="80"/>
+              <w:left w:type="dxa" w:w="100"/>
+              <w:bottom w:type="dxa" w:w="80"/>
+              <w:right w:type="dxa" w:w="100"/>
+            </w:tcMar>
+            <w:vAlign w:val="center"/>
+          </w:tcPr>
+          <w:p>
+            <w:r>
+              <w:rPr>
+                <w:b w:val="false"/>
+                <w:bCs w:val="false"/>
+                <w:color w:val="000000"/>
+                <w:sz w:val="19"/>
+                <w:szCs w:val="19"/>
+              </w:rPr>
+              <w:t xml:space="preserve">Owen Idehen</w:t>
+            </w:r>
+          </w:p>
+        </w:tc>
+        <w:tc>
+          <w:tcPr>
+            <w:tcW w:type="dxa" w:w="5080"/>
+            <w:tcMar>
+              <w:top w:type="dxa" w:w="80"/>
+              <w:left w:type="dxa" w:w="100"/>
+              <w:bottom w:type="dxa" w:w="80"/>
+              <w:right w:type="dxa" w:w="100"/>
+            </w:tcMar>
+            <w:vAlign w:val="center"/>
+          </w:tcPr>
+          <w:p>
+            <w:r>
+              <w:rPr>
+                <w:b w:val="false"/>
+                <w:bCs w:val="false"/>
+                <w:color w:val="000000"/>
+                <w:sz w:val="19"/>
+                <w:szCs w:val="19"/>
+              </w:rPr>
+              <w:t xml:space="preserve">Added CdrDownloaderErrorsAlarm (CloudWatch alarm on the Errors metric, publishing to the Datadog Forwarder SNS topic) and the 1st-of-month CDR record freshness check (throws — and therefore logs to CloudWatch — if the newest SDR period hasn't been published yet). Source commit 538dd2c.</w:t>
+            </w:r>
+          </w:p>
+        </w:tc>
+      </w:tr>
+    </w:tbl>
+    <w:p>
+      <w:pPr>
+        <w:spacing w:after="0" w:before="120"/>
+      </w:pPr>
+      <w:r>
+        <w:rPr>
+          <w:i/>
+          <w:iCs/>
+          <w:color w:val="777777"/>
+          <w:sz w:val="18"/>
+          <w:szCs w:val="18"/>
+        </w:rPr>
+        <w:t xml:space="preserve">Repository: portal_login_automation_for_sdr_download · Branch: claude/friendly-mendel-dx2yrv</w:t>
+      </w:r>
+    </w:p>
+    <w:p>
+      <w:pPr>
+        <w:pStyle w:val="Heading1"/>
+        <w:spacing w:after="120" w:before="240"/>
+      </w:pPr>
+      <w:r>
         <w:t xml:space="preserve">1. AWS Lambda Configuration (template.yaml)</w:t>
       </w:r>
     </w:p>
@@ -1266,6 +1607,27 @@
       </w:r>
     </w:p>
     <w:p>
+      <w:pPr>
+        <w:pStyle w:val="Heading2"/>
+        <w:spacing w:after="120" w:before="240"/>
+      </w:pPr>
+      <w:r>
+        <w:t xml:space="preserve">1.5 CDR record freshness check (new in v1.1)</w:t>
+      </w:r>
+    </w:p>
+    <w:p>
+      <w:pPr>
+        <w:spacing w:after="200" w:before="0"/>
+      </w:pPr>
+      <w:r>
+        <w:rPr>
+          <w:sz w:val="22"/>
+          <w:szCs w:val="22"/>
+        </w:rPr>
+        <w:t xml:space="preserve">On the 1st of the month (UTC), verifyLatestRecordIsAvailable() in src/index.js reads the newest SDR row's End Date and confirms it equals the last calendar day of the previous month — the period that should have just completed. If Gradwell hasn't published that period yet (the newest row is still last month's), the function throws instead of silently downloading and storing a stale file under the new month's S3 key. That throw is logged to CloudWatch Logs like any other error and trips CdrDownloaderErrorsAlarm, which — once the Datadog Forwarder topic ARN is populated — surfaces as a Datadog monitor event. This check is a no-op on every other day of the month, so manual test invokes are unaffected.</w:t>
+      </w:r>
+    </w:p>
+    <w:p>
       <w:r>
         <w:br w:type="page"/>
       </w:r>
@@ -2624,6 +2986,244 @@
           <w:sz w:val="17"/>
           <w:szCs w:val="17"/>
         </w:rPr>
+        <w:t xml:space="preserve">function isFirstOfMonthUtc(date = new Date()) {</w:t>
+      </w:r>
+    </w:p>
+    <w:p>
+      <w:pPr>
+        <w:shd w:fill="F2F2F2" w:color="auto" w:val="clear"/>
+        <w:spacing w:after="0" w:before="0" w:line="240"/>
+      </w:pPr>
+      <w:r>
+        <w:rPr>
+          <w:rFonts w:ascii="Consolas" w:cs="Consolas" w:eastAsia="Consolas" w:hAnsi="Consolas"/>
+          <w:sz w:val="17"/>
+          <w:szCs w:val="17"/>
+        </w:rPr>
+        <w:t xml:space="preserve">  return date.getUTCDate() === 1;</w:t>
+      </w:r>
+    </w:p>
+    <w:p>
+      <w:pPr>
+        <w:shd w:fill="F2F2F2" w:color="auto" w:val="clear"/>
+        <w:spacing w:after="0" w:before="0" w:line="240"/>
+      </w:pPr>
+      <w:r>
+        <w:rPr>
+          <w:rFonts w:ascii="Consolas" w:cs="Consolas" w:eastAsia="Consolas" w:hAnsi="Consolas"/>
+          <w:sz w:val="17"/>
+          <w:szCs w:val="17"/>
+        </w:rPr>
+        <w:t xml:space="preserve">}</w:t>
+      </w:r>
+    </w:p>
+    <w:p>
+      <w:pPr>
+        <w:shd w:fill="F2F2F2" w:color="auto" w:val="clear"/>
+        <w:spacing w:after="0" w:before="0" w:line="240"/>
+      </w:pPr>
+      <w:r>
+        <w:rPr>
+          <w:rFonts w:ascii="Consolas" w:cs="Consolas" w:eastAsia="Consolas" w:hAnsi="Consolas"/>
+          <w:sz w:val="17"/>
+          <w:szCs w:val="17"/>
+        </w:rPr>
+        <w:t xml:space="preserve"> </w:t>
+      </w:r>
+    </w:p>
+    <w:p>
+      <w:pPr>
+        <w:shd w:fill="F2F2F2" w:color="auto" w:val="clear"/>
+        <w:spacing w:after="0" w:before="0" w:line="240"/>
+      </w:pPr>
+      <w:r>
+        <w:rPr>
+          <w:rFonts w:ascii="Consolas" w:cs="Consolas" w:eastAsia="Consolas" w:hAnsi="Consolas"/>
+          <w:sz w:val="17"/>
+          <w:szCs w:val="17"/>
+        </w:rPr>
+        <w:t xml:space="preserve">function lastDayOfPreviousMonthUtc(date = new Date()) {</w:t>
+      </w:r>
+    </w:p>
+    <w:p>
+      <w:pPr>
+        <w:shd w:fill="F2F2F2" w:color="auto" w:val="clear"/>
+        <w:spacing w:after="0" w:before="0" w:line="240"/>
+      </w:pPr>
+      <w:r>
+        <w:rPr>
+          <w:rFonts w:ascii="Consolas" w:cs="Consolas" w:eastAsia="Consolas" w:hAnsi="Consolas"/>
+          <w:sz w:val="17"/>
+          <w:szCs w:val="17"/>
+        </w:rPr>
+        <w:t xml:space="preserve">  // Day 0 of the current month is the last day of the previous month.</w:t>
+      </w:r>
+    </w:p>
+    <w:p>
+      <w:pPr>
+        <w:shd w:fill="F2F2F2" w:color="auto" w:val="clear"/>
+        <w:spacing w:after="0" w:before="0" w:line="240"/>
+      </w:pPr>
+      <w:r>
+        <w:rPr>
+          <w:rFonts w:ascii="Consolas" w:cs="Consolas" w:eastAsia="Consolas" w:hAnsi="Consolas"/>
+          <w:sz w:val="17"/>
+          <w:szCs w:val="17"/>
+        </w:rPr>
+        <w:t xml:space="preserve">  return new Date(Date.UTC(date.getUTCFullYear(), date.getUTCMonth(), 0));</w:t>
+      </w:r>
+    </w:p>
+    <w:p>
+      <w:pPr>
+        <w:shd w:fill="F2F2F2" w:color="auto" w:val="clear"/>
+        <w:spacing w:after="0" w:before="0" w:line="240"/>
+      </w:pPr>
+      <w:r>
+        <w:rPr>
+          <w:rFonts w:ascii="Consolas" w:cs="Consolas" w:eastAsia="Consolas" w:hAnsi="Consolas"/>
+          <w:sz w:val="17"/>
+          <w:szCs w:val="17"/>
+        </w:rPr>
+        <w:t xml:space="preserve">}</w:t>
+      </w:r>
+    </w:p>
+    <w:p>
+      <w:pPr>
+        <w:shd w:fill="F2F2F2" w:color="auto" w:val="clear"/>
+        <w:spacing w:after="0" w:before="0" w:line="240"/>
+      </w:pPr>
+      <w:r>
+        <w:rPr>
+          <w:rFonts w:ascii="Consolas" w:cs="Consolas" w:eastAsia="Consolas" w:hAnsi="Consolas"/>
+          <w:sz w:val="17"/>
+          <w:szCs w:val="17"/>
+        </w:rPr>
+        <w:t xml:space="preserve"> </w:t>
+      </w:r>
+    </w:p>
+    <w:p>
+      <w:pPr>
+        <w:shd w:fill="F2F2F2" w:color="auto" w:val="clear"/>
+        <w:spacing w:after="0" w:before="0" w:line="240"/>
+      </w:pPr>
+      <w:r>
+        <w:rPr>
+          <w:rFonts w:ascii="Consolas" w:cs="Consolas" w:eastAsia="Consolas" w:hAnsi="Consolas"/>
+          <w:sz w:val="17"/>
+          <w:szCs w:val="17"/>
+        </w:rPr>
+        <w:t xml:space="preserve">function isSameUtcCalendarDate(a, b) {</w:t>
+      </w:r>
+    </w:p>
+    <w:p>
+      <w:pPr>
+        <w:shd w:fill="F2F2F2" w:color="auto" w:val="clear"/>
+        <w:spacing w:after="0" w:before="0" w:line="240"/>
+      </w:pPr>
+      <w:r>
+        <w:rPr>
+          <w:rFonts w:ascii="Consolas" w:cs="Consolas" w:eastAsia="Consolas" w:hAnsi="Consolas"/>
+          <w:sz w:val="17"/>
+          <w:szCs w:val="17"/>
+        </w:rPr>
+        <w:t xml:space="preserve">  return (</w:t>
+      </w:r>
+    </w:p>
+    <w:p>
+      <w:pPr>
+        <w:shd w:fill="F2F2F2" w:color="auto" w:val="clear"/>
+        <w:spacing w:after="0" w:before="0" w:line="240"/>
+      </w:pPr>
+      <w:r>
+        <w:rPr>
+          <w:rFonts w:ascii="Consolas" w:cs="Consolas" w:eastAsia="Consolas" w:hAnsi="Consolas"/>
+          <w:sz w:val="17"/>
+          <w:szCs w:val="17"/>
+        </w:rPr>
+        <w:t xml:space="preserve">    a.getUTCFullYear() === b.getUTCFullYear() &amp;&amp;</w:t>
+      </w:r>
+    </w:p>
+    <w:p>
+      <w:pPr>
+        <w:shd w:fill="F2F2F2" w:color="auto" w:val="clear"/>
+        <w:spacing w:after="0" w:before="0" w:line="240"/>
+      </w:pPr>
+      <w:r>
+        <w:rPr>
+          <w:rFonts w:ascii="Consolas" w:cs="Consolas" w:eastAsia="Consolas" w:hAnsi="Consolas"/>
+          <w:sz w:val="17"/>
+          <w:szCs w:val="17"/>
+        </w:rPr>
+        <w:t xml:space="preserve">    a.getUTCMonth() === b.getUTCMonth() &amp;&amp;</w:t>
+      </w:r>
+    </w:p>
+    <w:p>
+      <w:pPr>
+        <w:shd w:fill="F2F2F2" w:color="auto" w:val="clear"/>
+        <w:spacing w:after="0" w:before="0" w:line="240"/>
+      </w:pPr>
+      <w:r>
+        <w:rPr>
+          <w:rFonts w:ascii="Consolas" w:cs="Consolas" w:eastAsia="Consolas" w:hAnsi="Consolas"/>
+          <w:sz w:val="17"/>
+          <w:szCs w:val="17"/>
+        </w:rPr>
+        <w:t xml:space="preserve">    a.getUTCDate() === b.getUTCDate()</w:t>
+      </w:r>
+    </w:p>
+    <w:p>
+      <w:pPr>
+        <w:shd w:fill="F2F2F2" w:color="auto" w:val="clear"/>
+        <w:spacing w:after="0" w:before="0" w:line="240"/>
+      </w:pPr>
+      <w:r>
+        <w:rPr>
+          <w:rFonts w:ascii="Consolas" w:cs="Consolas" w:eastAsia="Consolas" w:hAnsi="Consolas"/>
+          <w:sz w:val="17"/>
+          <w:szCs w:val="17"/>
+        </w:rPr>
+        <w:t xml:space="preserve">  );</w:t>
+      </w:r>
+    </w:p>
+    <w:p>
+      <w:pPr>
+        <w:shd w:fill="F2F2F2" w:color="auto" w:val="clear"/>
+        <w:spacing w:after="0" w:before="0" w:line="240"/>
+      </w:pPr>
+      <w:r>
+        <w:rPr>
+          <w:rFonts w:ascii="Consolas" w:cs="Consolas" w:eastAsia="Consolas" w:hAnsi="Consolas"/>
+          <w:sz w:val="17"/>
+          <w:szCs w:val="17"/>
+        </w:rPr>
+        <w:t xml:space="preserve">}</w:t>
+      </w:r>
+    </w:p>
+    <w:p>
+      <w:pPr>
+        <w:shd w:fill="F2F2F2" w:color="auto" w:val="clear"/>
+        <w:spacing w:after="0" w:before="0" w:line="240"/>
+      </w:pPr>
+      <w:r>
+        <w:rPr>
+          <w:rFonts w:ascii="Consolas" w:cs="Consolas" w:eastAsia="Consolas" w:hAnsi="Consolas"/>
+          <w:sz w:val="17"/>
+          <w:szCs w:val="17"/>
+        </w:rPr>
+        <w:t xml:space="preserve"> </w:t>
+      </w:r>
+    </w:p>
+    <w:p>
+      <w:pPr>
+        <w:shd w:fill="F2F2F2" w:color="auto" w:val="clear"/>
+        <w:spacing w:after="0" w:before="0" w:line="240"/>
+      </w:pPr>
+      <w:r>
+        <w:rPr>
+          <w:rFonts w:ascii="Consolas" w:cs="Consolas" w:eastAsia="Consolas" w:hAnsi="Consolas"/>
+          <w:sz w:val="17"/>
+          <w:szCs w:val="17"/>
+        </w:rPr>
         <w:t xml:space="preserve">/**</w:t>
       </w:r>
     </w:p>
@@ -2638,6 +3238,440 @@
           <w:sz w:val="17"/>
           <w:szCs w:val="17"/>
         </w:rPr>
+        <w:t xml:space="preserve"> * On the 1st of the month, the newest SDR row should cover the period that</w:t>
+      </w:r>
+    </w:p>
+    <w:p>
+      <w:pPr>
+        <w:shd w:fill="F2F2F2" w:color="auto" w:val="clear"/>
+        <w:spacing w:after="0" w:before="0" w:line="240"/>
+      </w:pPr>
+      <w:r>
+        <w:rPr>
+          <w:rFonts w:ascii="Consolas" w:cs="Consolas" w:eastAsia="Consolas" w:hAnsi="Consolas"/>
+          <w:sz w:val="17"/>
+          <w:szCs w:val="17"/>
+        </w:rPr>
+        <w:t xml:space="preserve"> * just completed (i.e. end on the last day of the previous month). If</w:t>
+      </w:r>
+    </w:p>
+    <w:p>
+      <w:pPr>
+        <w:shd w:fill="F2F2F2" w:color="auto" w:val="clear"/>
+        <w:spacing w:after="0" w:before="0" w:line="240"/>
+      </w:pPr>
+      <w:r>
+        <w:rPr>
+          <w:rFonts w:ascii="Consolas" w:cs="Consolas" w:eastAsia="Consolas" w:hAnsi="Consolas"/>
+          <w:sz w:val="17"/>
+          <w:szCs w:val="17"/>
+        </w:rPr>
+        <w:t xml:space="preserve"> * Gradwell hasn't published that period yet, downloading the next-newest</w:t>
+      </w:r>
+    </w:p>
+    <w:p>
+      <w:pPr>
+        <w:shd w:fill="F2F2F2" w:color="auto" w:val="clear"/>
+        <w:spacing w:after="0" w:before="0" w:line="240"/>
+      </w:pPr>
+      <w:r>
+        <w:rPr>
+          <w:rFonts w:ascii="Consolas" w:cs="Consolas" w:eastAsia="Consolas" w:hAnsi="Consolas"/>
+          <w:sz w:val="17"/>
+          <w:szCs w:val="17"/>
+        </w:rPr>
+        <w:t xml:space="preserve"> * row would silently store last month's file under this month's S3 key.</w:t>
+      </w:r>
+    </w:p>
+    <w:p>
+      <w:pPr>
+        <w:shd w:fill="F2F2F2" w:color="auto" w:val="clear"/>
+        <w:spacing w:after="0" w:before="0" w:line="240"/>
+      </w:pPr>
+      <w:r>
+        <w:rPr>
+          <w:rFonts w:ascii="Consolas" w:cs="Consolas" w:eastAsia="Consolas" w:hAnsi="Consolas"/>
+          <w:sz w:val="17"/>
+          <w:szCs w:val="17"/>
+        </w:rPr>
+        <w:t xml:space="preserve"> * Fail loudly instead, so it surfaces as a Lambda error — which the</w:t>
+      </w:r>
+    </w:p>
+    <w:p>
+      <w:pPr>
+        <w:shd w:fill="F2F2F2" w:color="auto" w:val="clear"/>
+        <w:spacing w:after="0" w:before="0" w:line="240"/>
+      </w:pPr>
+      <w:r>
+        <w:rPr>
+          <w:rFonts w:ascii="Consolas" w:cs="Consolas" w:eastAsia="Consolas" w:hAnsi="Consolas"/>
+          <w:sz w:val="17"/>
+          <w:szCs w:val="17"/>
+        </w:rPr>
+        <w:t xml:space="preserve"> * CloudWatch alarm on the Errors metric (and therefore Datadog) picks up.</w:t>
+      </w:r>
+    </w:p>
+    <w:p>
+      <w:pPr>
+        <w:shd w:fill="F2F2F2" w:color="auto" w:val="clear"/>
+        <w:spacing w:after="0" w:before="0" w:line="240"/>
+      </w:pPr>
+      <w:r>
+        <w:rPr>
+          <w:rFonts w:ascii="Consolas" w:cs="Consolas" w:eastAsia="Consolas" w:hAnsi="Consolas"/>
+          <w:sz w:val="17"/>
+          <w:szCs w:val="17"/>
+        </w:rPr>
+        <w:t xml:space="preserve"> */</w:t>
+      </w:r>
+    </w:p>
+    <w:p>
+      <w:pPr>
+        <w:shd w:fill="F2F2F2" w:color="auto" w:val="clear"/>
+        <w:spacing w:after="0" w:before="0" w:line="240"/>
+      </w:pPr>
+      <w:r>
+        <w:rPr>
+          <w:rFonts w:ascii="Consolas" w:cs="Consolas" w:eastAsia="Consolas" w:hAnsi="Consolas"/>
+          <w:sz w:val="17"/>
+          <w:szCs w:val="17"/>
+        </w:rPr>
+        <w:t xml:space="preserve">async function verifyLatestRecordIsAvailable(page) {</w:t>
+      </w:r>
+    </w:p>
+    <w:p>
+      <w:pPr>
+        <w:shd w:fill="F2F2F2" w:color="auto" w:val="clear"/>
+        <w:spacing w:after="0" w:before="0" w:line="240"/>
+      </w:pPr>
+      <w:r>
+        <w:rPr>
+          <w:rFonts w:ascii="Consolas" w:cs="Consolas" w:eastAsia="Consolas" w:hAnsi="Consolas"/>
+          <w:sz w:val="17"/>
+          <w:szCs w:val="17"/>
+        </w:rPr>
+        <w:t xml:space="preserve">  if (!isFirstOfMonthUtc()) return;</w:t>
+      </w:r>
+    </w:p>
+    <w:p>
+      <w:pPr>
+        <w:shd w:fill="F2F2F2" w:color="auto" w:val="clear"/>
+        <w:spacing w:after="0" w:before="0" w:line="240"/>
+      </w:pPr>
+      <w:r>
+        <w:rPr>
+          <w:rFonts w:ascii="Consolas" w:cs="Consolas" w:eastAsia="Consolas" w:hAnsi="Consolas"/>
+          <w:sz w:val="17"/>
+          <w:szCs w:val="17"/>
+        </w:rPr>
+        <w:t xml:space="preserve"> </w:t>
+      </w:r>
+    </w:p>
+    <w:p>
+      <w:pPr>
+        <w:shd w:fill="F2F2F2" w:color="auto" w:val="clear"/>
+        <w:spacing w:after="0" w:before="0" w:line="240"/>
+      </w:pPr>
+      <w:r>
+        <w:rPr>
+          <w:rFonts w:ascii="Consolas" w:cs="Consolas" w:eastAsia="Consolas" w:hAnsi="Consolas"/>
+          <w:sz w:val="17"/>
+          <w:szCs w:val="17"/>
+        </w:rPr>
+        <w:t xml:space="preserve">  const cellText = (</w:t>
+      </w:r>
+    </w:p>
+    <w:p>
+      <w:pPr>
+        <w:shd w:fill="F2F2F2" w:color="auto" w:val="clear"/>
+        <w:spacing w:after="0" w:before="0" w:line="240"/>
+      </w:pPr>
+      <w:r>
+        <w:rPr>
+          <w:rFonts w:ascii="Consolas" w:cs="Consolas" w:eastAsia="Consolas" w:hAnsi="Consolas"/>
+          <w:sz w:val="17"/>
+          <w:szCs w:val="17"/>
+        </w:rPr>
+        <w:t xml:space="preserve">    await page.locator(config.selectors.latestEndDateCell).first().textContent()</w:t>
+      </w:r>
+    </w:p>
+    <w:p>
+      <w:pPr>
+        <w:shd w:fill="F2F2F2" w:color="auto" w:val="clear"/>
+        <w:spacing w:after="0" w:before="0" w:line="240"/>
+      </w:pPr>
+      <w:r>
+        <w:rPr>
+          <w:rFonts w:ascii="Consolas" w:cs="Consolas" w:eastAsia="Consolas" w:hAnsi="Consolas"/>
+          <w:sz w:val="17"/>
+          <w:szCs w:val="17"/>
+        </w:rPr>
+        <w:t xml:space="preserve">  ).trim();</w:t>
+      </w:r>
+    </w:p>
+    <w:p>
+      <w:pPr>
+        <w:shd w:fill="F2F2F2" w:color="auto" w:val="clear"/>
+        <w:spacing w:after="0" w:before="0" w:line="240"/>
+      </w:pPr>
+      <w:r>
+        <w:rPr>
+          <w:rFonts w:ascii="Consolas" w:cs="Consolas" w:eastAsia="Consolas" w:hAnsi="Consolas"/>
+          <w:sz w:val="17"/>
+          <w:szCs w:val="17"/>
+        </w:rPr>
+        <w:t xml:space="preserve"> </w:t>
+      </w:r>
+    </w:p>
+    <w:p>
+      <w:pPr>
+        <w:shd w:fill="F2F2F2" w:color="auto" w:val="clear"/>
+        <w:spacing w:after="0" w:before="0" w:line="240"/>
+      </w:pPr>
+      <w:r>
+        <w:rPr>
+          <w:rFonts w:ascii="Consolas" w:cs="Consolas" w:eastAsia="Consolas" w:hAnsi="Consolas"/>
+          <w:sz w:val="17"/>
+          <w:szCs w:val="17"/>
+        </w:rPr>
+        <w:t xml:space="preserve">  const datePart = cellText.split(",")[0].trim();</w:t>
+      </w:r>
+    </w:p>
+    <w:p>
+      <w:pPr>
+        <w:shd w:fill="F2F2F2" w:color="auto" w:val="clear"/>
+        <w:spacing w:after="0" w:before="0" w:line="240"/>
+      </w:pPr>
+      <w:r>
+        <w:rPr>
+          <w:rFonts w:ascii="Consolas" w:cs="Consolas" w:eastAsia="Consolas" w:hAnsi="Consolas"/>
+          <w:sz w:val="17"/>
+          <w:szCs w:val="17"/>
+        </w:rPr>
+        <w:t xml:space="preserve">  const endDate = new Date(`${datePart} UTC`);</w:t>
+      </w:r>
+    </w:p>
+    <w:p>
+      <w:pPr>
+        <w:shd w:fill="F2F2F2" w:color="auto" w:val="clear"/>
+        <w:spacing w:after="0" w:before="0" w:line="240"/>
+      </w:pPr>
+      <w:r>
+        <w:rPr>
+          <w:rFonts w:ascii="Consolas" w:cs="Consolas" w:eastAsia="Consolas" w:hAnsi="Consolas"/>
+          <w:sz w:val="17"/>
+          <w:szCs w:val="17"/>
+        </w:rPr>
+        <w:t xml:space="preserve">  if (isNaN(endDate.getTime())) {</w:t>
+      </w:r>
+    </w:p>
+    <w:p>
+      <w:pPr>
+        <w:shd w:fill="F2F2F2" w:color="auto" w:val="clear"/>
+        <w:spacing w:after="0" w:before="0" w:line="240"/>
+      </w:pPr>
+      <w:r>
+        <w:rPr>
+          <w:rFonts w:ascii="Consolas" w:cs="Consolas" w:eastAsia="Consolas" w:hAnsi="Consolas"/>
+          <w:sz w:val="17"/>
+          <w:szCs w:val="17"/>
+        </w:rPr>
+        <w:t xml:space="preserve">    throw new Error(</w:t>
+      </w:r>
+    </w:p>
+    <w:p>
+      <w:pPr>
+        <w:shd w:fill="F2F2F2" w:color="auto" w:val="clear"/>
+        <w:spacing w:after="0" w:before="0" w:line="240"/>
+      </w:pPr>
+      <w:r>
+        <w:rPr>
+          <w:rFonts w:ascii="Consolas" w:cs="Consolas" w:eastAsia="Consolas" w:hAnsi="Consolas"/>
+          <w:sz w:val="17"/>
+          <w:szCs w:val="17"/>
+        </w:rPr>
+        <w:t xml:space="preserve">      `Could not parse the latest SDR period's end date from "${cellText}" — the SDR table format may have changed.`</w:t>
+      </w:r>
+    </w:p>
+    <w:p>
+      <w:pPr>
+        <w:shd w:fill="F2F2F2" w:color="auto" w:val="clear"/>
+        <w:spacing w:after="0" w:before="0" w:line="240"/>
+      </w:pPr>
+      <w:r>
+        <w:rPr>
+          <w:rFonts w:ascii="Consolas" w:cs="Consolas" w:eastAsia="Consolas" w:hAnsi="Consolas"/>
+          <w:sz w:val="17"/>
+          <w:szCs w:val="17"/>
+        </w:rPr>
+        <w:t xml:space="preserve">    );</w:t>
+      </w:r>
+    </w:p>
+    <w:p>
+      <w:pPr>
+        <w:shd w:fill="F2F2F2" w:color="auto" w:val="clear"/>
+        <w:spacing w:after="0" w:before="0" w:line="240"/>
+      </w:pPr>
+      <w:r>
+        <w:rPr>
+          <w:rFonts w:ascii="Consolas" w:cs="Consolas" w:eastAsia="Consolas" w:hAnsi="Consolas"/>
+          <w:sz w:val="17"/>
+          <w:szCs w:val="17"/>
+        </w:rPr>
+        <w:t xml:space="preserve">  }</w:t>
+      </w:r>
+    </w:p>
+    <w:p>
+      <w:pPr>
+        <w:shd w:fill="F2F2F2" w:color="auto" w:val="clear"/>
+        <w:spacing w:after="0" w:before="0" w:line="240"/>
+      </w:pPr>
+      <w:r>
+        <w:rPr>
+          <w:rFonts w:ascii="Consolas" w:cs="Consolas" w:eastAsia="Consolas" w:hAnsi="Consolas"/>
+          <w:sz w:val="17"/>
+          <w:szCs w:val="17"/>
+        </w:rPr>
+        <w:t xml:space="preserve"> </w:t>
+      </w:r>
+    </w:p>
+    <w:p>
+      <w:pPr>
+        <w:shd w:fill="F2F2F2" w:color="auto" w:val="clear"/>
+        <w:spacing w:after="0" w:before="0" w:line="240"/>
+      </w:pPr>
+      <w:r>
+        <w:rPr>
+          <w:rFonts w:ascii="Consolas" w:cs="Consolas" w:eastAsia="Consolas" w:hAnsi="Consolas"/>
+          <w:sz w:val="17"/>
+          <w:szCs w:val="17"/>
+        </w:rPr>
+        <w:t xml:space="preserve">  const expected = lastDayOfPreviousMonthUtc();</w:t>
+      </w:r>
+    </w:p>
+    <w:p>
+      <w:pPr>
+        <w:shd w:fill="F2F2F2" w:color="auto" w:val="clear"/>
+        <w:spacing w:after="0" w:before="0" w:line="240"/>
+      </w:pPr>
+      <w:r>
+        <w:rPr>
+          <w:rFonts w:ascii="Consolas" w:cs="Consolas" w:eastAsia="Consolas" w:hAnsi="Consolas"/>
+          <w:sz w:val="17"/>
+          <w:szCs w:val="17"/>
+        </w:rPr>
+        <w:t xml:space="preserve">  if (!isSameUtcCalendarDate(endDate, expected)) {</w:t>
+      </w:r>
+    </w:p>
+    <w:p>
+      <w:pPr>
+        <w:shd w:fill="F2F2F2" w:color="auto" w:val="clear"/>
+        <w:spacing w:after="0" w:before="0" w:line="240"/>
+      </w:pPr>
+      <w:r>
+        <w:rPr>
+          <w:rFonts w:ascii="Consolas" w:cs="Consolas" w:eastAsia="Consolas" w:hAnsi="Consolas"/>
+          <w:sz w:val="17"/>
+          <w:szCs w:val="17"/>
+        </w:rPr>
+        <w:t xml:space="preserve">    throw new Error(</w:t>
+      </w:r>
+    </w:p>
+    <w:p>
+      <w:pPr>
+        <w:shd w:fill="F2F2F2" w:color="auto" w:val="clear"/>
+        <w:spacing w:after="0" w:before="0" w:line="240"/>
+      </w:pPr>
+      <w:r>
+        <w:rPr>
+          <w:rFonts w:ascii="Consolas" w:cs="Consolas" w:eastAsia="Consolas" w:hAnsi="Consolas"/>
+          <w:sz w:val="17"/>
+          <w:szCs w:val="17"/>
+        </w:rPr>
+        <w:t xml:space="preserve">      `New CDR record not yet available: expected the newest SDR period to end ${expected.toISOString().slice(0, 10)} (last day of the previous month), but the newest row on the page ends ${endDate.toISOString().slice(0, 10)} ("${cellText}"). Gradwell likely hasn't published this month's CDR yet.`</w:t>
+      </w:r>
+    </w:p>
+    <w:p>
+      <w:pPr>
+        <w:shd w:fill="F2F2F2" w:color="auto" w:val="clear"/>
+        <w:spacing w:after="0" w:before="0" w:line="240"/>
+      </w:pPr>
+      <w:r>
+        <w:rPr>
+          <w:rFonts w:ascii="Consolas" w:cs="Consolas" w:eastAsia="Consolas" w:hAnsi="Consolas"/>
+          <w:sz w:val="17"/>
+          <w:szCs w:val="17"/>
+        </w:rPr>
+        <w:t xml:space="preserve">    );</w:t>
+      </w:r>
+    </w:p>
+    <w:p>
+      <w:pPr>
+        <w:shd w:fill="F2F2F2" w:color="auto" w:val="clear"/>
+        <w:spacing w:after="0" w:before="0" w:line="240"/>
+      </w:pPr>
+      <w:r>
+        <w:rPr>
+          <w:rFonts w:ascii="Consolas" w:cs="Consolas" w:eastAsia="Consolas" w:hAnsi="Consolas"/>
+          <w:sz w:val="17"/>
+          <w:szCs w:val="17"/>
+        </w:rPr>
+        <w:t xml:space="preserve">  }</w:t>
+      </w:r>
+    </w:p>
+    <w:p>
+      <w:pPr>
+        <w:shd w:fill="F2F2F2" w:color="auto" w:val="clear"/>
+        <w:spacing w:after="0" w:before="0" w:line="240"/>
+      </w:pPr>
+      <w:r>
+        <w:rPr>
+          <w:rFonts w:ascii="Consolas" w:cs="Consolas" w:eastAsia="Consolas" w:hAnsi="Consolas"/>
+          <w:sz w:val="17"/>
+          <w:szCs w:val="17"/>
+        </w:rPr>
+        <w:t xml:space="preserve">}</w:t>
+      </w:r>
+    </w:p>
+    <w:p>
+      <w:pPr>
+        <w:shd w:fill="F2F2F2" w:color="auto" w:val="clear"/>
+        <w:spacing w:after="0" w:before="0" w:line="240"/>
+      </w:pPr>
+      <w:r>
+        <w:rPr>
+          <w:rFonts w:ascii="Consolas" w:cs="Consolas" w:eastAsia="Consolas" w:hAnsi="Consolas"/>
+          <w:sz w:val="17"/>
+          <w:szCs w:val="17"/>
+        </w:rPr>
+        <w:t xml:space="preserve"> </w:t>
+      </w:r>
+    </w:p>
+    <w:p>
+      <w:pPr>
+        <w:shd w:fill="F2F2F2" w:color="auto" w:val="clear"/>
+        <w:spacing w:after="0" w:before="0" w:line="240"/>
+      </w:pPr>
+      <w:r>
+        <w:rPr>
+          <w:rFonts w:ascii="Consolas" w:cs="Consolas" w:eastAsia="Consolas" w:hAnsi="Consolas"/>
+          <w:sz w:val="17"/>
+          <w:szCs w:val="17"/>
+        </w:rPr>
+        <w:t xml:space="preserve">/**</w:t>
+      </w:r>
+    </w:p>
+    <w:p>
+      <w:pPr>
+        <w:shd w:fill="F2F2F2" w:color="auto" w:val="clear"/>
+        <w:spacing w:after="0" w:before="0" w:line="240"/>
+      </w:pPr>
+      <w:r>
+        <w:rPr>
+          <w:rFonts w:ascii="Consolas" w:cs="Consolas" w:eastAsia="Consolas" w:hAnsi="Consolas"/>
+          <w:sz w:val="17"/>
+          <w:szCs w:val="17"/>
+        </w:rPr>
         <w:t xml:space="preserve"> * Clicks the download link/button and reads the resulting file into memory.</w:t>
       </w:r>
     </w:p>
@@ -3633,6 +4667,34 @@
           <w:szCs w:val="17"/>
         </w:rPr>
         <w:t xml:space="preserve">    await captureDebugScreenshot(page, bucket, runId, "03-sdr-section");</w:t>
+      </w:r>
+    </w:p>
+    <w:p>
+      <w:pPr>
+        <w:shd w:fill="F2F2F2" w:color="auto" w:val="clear"/>
+        <w:spacing w:after="0" w:before="0" w:line="240"/>
+      </w:pPr>
+      <w:r>
+        <w:rPr>
+          <w:rFonts w:ascii="Consolas" w:cs="Consolas" w:eastAsia="Consolas" w:hAnsi="Consolas"/>
+          <w:sz w:val="17"/>
+          <w:szCs w:val="17"/>
+        </w:rPr>
+        <w:t xml:space="preserve"> </w:t>
+      </w:r>
+    </w:p>
+    <w:p>
+      <w:pPr>
+        <w:shd w:fill="F2F2F2" w:color="auto" w:val="clear"/>
+        <w:spacing w:after="0" w:before="0" w:line="240"/>
+      </w:pPr>
+      <w:r>
+        <w:rPr>
+          <w:rFonts w:ascii="Consolas" w:cs="Consolas" w:eastAsia="Consolas" w:hAnsi="Consolas"/>
+          <w:sz w:val="17"/>
+          <w:szCs w:val="17"/>
+        </w:rPr>
+        <w:t xml:space="preserve">    await verifyLatestRecordIsAvailable(page);</w:t>
       </w:r>
     </w:p>
     <w:p>
@@ -4521,6 +5583,90 @@
           <w:szCs w:val="17"/>
         </w:rPr>
         <w:t xml:space="preserve">      "table tbody tr:first-child td:last-child a, table tbody tr:first-child td:last-child button, table tbody tr:first-child a, table tbody tr:first-child button"</w:t>
+      </w:r>
+    </w:p>
+    <w:p>
+      <w:pPr>
+        <w:shd w:fill="F2F2F2" w:color="auto" w:val="clear"/>
+        <w:spacing w:after="0" w:before="0" w:line="240"/>
+      </w:pPr>
+      <w:r>
+        <w:rPr>
+          <w:rFonts w:ascii="Consolas" w:cs="Consolas" w:eastAsia="Consolas" w:hAnsi="Consolas"/>
+          <w:sz w:val="17"/>
+          <w:szCs w:val="17"/>
+        </w:rPr>
+        <w:t xml:space="preserve">    ),</w:t>
+      </w:r>
+    </w:p>
+    <w:p>
+      <w:pPr>
+        <w:shd w:fill="F2F2F2" w:color="auto" w:val="clear"/>
+        <w:spacing w:after="0" w:before="0" w:line="240"/>
+      </w:pPr>
+      <w:r>
+        <w:rPr>
+          <w:rFonts w:ascii="Consolas" w:cs="Consolas" w:eastAsia="Consolas" w:hAnsi="Consolas"/>
+          <w:sz w:val="17"/>
+          <w:szCs w:val="17"/>
+        </w:rPr>
+        <w:t xml:space="preserve">    // "End Date" is the 2nd column (Start Date / End Date / Download) of the</w:t>
+      </w:r>
+    </w:p>
+    <w:p>
+      <w:pPr>
+        <w:shd w:fill="F2F2F2" w:color="auto" w:val="clear"/>
+        <w:spacing w:after="0" w:before="0" w:line="240"/>
+      </w:pPr>
+      <w:r>
+        <w:rPr>
+          <w:rFonts w:ascii="Consolas" w:cs="Consolas" w:eastAsia="Consolas" w:hAnsi="Consolas"/>
+          <w:sz w:val="17"/>
+          <w:szCs w:val="17"/>
+        </w:rPr>
+        <w:t xml:space="preserve">    // newest (first) row.</w:t>
+      </w:r>
+    </w:p>
+    <w:p>
+      <w:pPr>
+        <w:shd w:fill="F2F2F2" w:color="auto" w:val="clear"/>
+        <w:spacing w:after="0" w:before="0" w:line="240"/>
+      </w:pPr>
+      <w:r>
+        <w:rPr>
+          <w:rFonts w:ascii="Consolas" w:cs="Consolas" w:eastAsia="Consolas" w:hAnsi="Consolas"/>
+          <w:sz w:val="17"/>
+          <w:szCs w:val="17"/>
+        </w:rPr>
+        <w:t xml:space="preserve">    latestEndDateCell: env(</w:t>
+      </w:r>
+    </w:p>
+    <w:p>
+      <w:pPr>
+        <w:shd w:fill="F2F2F2" w:color="auto" w:val="clear"/>
+        <w:spacing w:after="0" w:before="0" w:line="240"/>
+      </w:pPr>
+      <w:r>
+        <w:rPr>
+          <w:rFonts w:ascii="Consolas" w:cs="Consolas" w:eastAsia="Consolas" w:hAnsi="Consolas"/>
+          <w:sz w:val="17"/>
+          <w:szCs w:val="17"/>
+        </w:rPr>
+        <w:t xml:space="preserve">      "SELECTOR_LATEST_END_DATE_CELL",</w:t>
+      </w:r>
+    </w:p>
+    <w:p>
+      <w:pPr>
+        <w:shd w:fill="F2F2F2" w:color="auto" w:val="clear"/>
+        <w:spacing w:after="0" w:before="0" w:line="240"/>
+      </w:pPr>
+      <w:r>
+        <w:rPr>
+          <w:rFonts w:ascii="Consolas" w:cs="Consolas" w:eastAsia="Consolas" w:hAnsi="Consolas"/>
+          <w:sz w:val="17"/>
+          <w:szCs w:val="17"/>
+        </w:rPr>
+        <w:t xml:space="preserve">      "table tbody tr:first-child td:nth-child(2)"</w:t>
       </w:r>
     </w:p>
     <w:p>

</xml_diff>

<commit_message>
Update Lambda config Word export for prefix-scoped S3 IAM policy
Adds v1.2 to the Version Control table and refreshes the embedded
template.yaml snippet and IAM permissions prose to reflect the
cdr/*, debug/* prefix-scoped s3:PutObject statement (commit 9bae2d8).

Co-Authored-By: Claude Sonnet 5 <noreply@anthropic.com>
Claude-Session: https://claude.ai/code/session_01Q36wM6QGPasir3AQTij9Uf
</commit_message>
<xml_diff>
--- a/CdrDownloaderFunction-Lambda-Config.docx
+++ b/CdrDownloaderFunction-Lambda-Config.docx
@@ -381,6 +381,104 @@
           </w:p>
         </w:tc>
       </w:tr>
+      <w:tr>
+        <w:tc>
+          <w:tcPr>
+            <w:tcW w:type="dxa" w:w="1200"/>
+            <w:tcMar>
+              <w:top w:type="dxa" w:w="80"/>
+              <w:left w:type="dxa" w:w="100"/>
+              <w:bottom w:type="dxa" w:w="80"/>
+              <w:right w:type="dxa" w:w="100"/>
+            </w:tcMar>
+            <w:vAlign w:val="center"/>
+          </w:tcPr>
+          <w:p>
+            <w:r>
+              <w:rPr>
+                <w:b w:val="false"/>
+                <w:bCs w:val="false"/>
+                <w:color w:val="000000"/>
+                <w:sz w:val="19"/>
+                <w:szCs w:val="19"/>
+              </w:rPr>
+              <w:t xml:space="preserve">1.2</w:t>
+            </w:r>
+          </w:p>
+        </w:tc>
+        <w:tc>
+          <w:tcPr>
+            <w:tcW w:type="dxa" w:w="1600"/>
+            <w:tcMar>
+              <w:top w:type="dxa" w:w="80"/>
+              <w:left w:type="dxa" w:w="100"/>
+              <w:bottom w:type="dxa" w:w="80"/>
+              <w:right w:type="dxa" w:w="100"/>
+            </w:tcMar>
+            <w:vAlign w:val="center"/>
+          </w:tcPr>
+          <w:p>
+            <w:r>
+              <w:rPr>
+                <w:b w:val="false"/>
+                <w:bCs w:val="false"/>
+                <w:color w:val="000000"/>
+                <w:sz w:val="19"/>
+                <w:szCs w:val="19"/>
+              </w:rPr>
+              <w:t xml:space="preserve">2026-09-18</w:t>
+            </w:r>
+          </w:p>
+        </w:tc>
+        <w:tc>
+          <w:tcPr>
+            <w:tcW w:type="dxa" w:w="2200"/>
+            <w:tcMar>
+              <w:top w:type="dxa" w:w="80"/>
+              <w:left w:type="dxa" w:w="100"/>
+              <w:bottom w:type="dxa" w:w="80"/>
+              <w:right w:type="dxa" w:w="100"/>
+            </w:tcMar>
+            <w:vAlign w:val="center"/>
+          </w:tcPr>
+          <w:p>
+            <w:r>
+              <w:rPr>
+                <w:b w:val="false"/>
+                <w:bCs w:val="false"/>
+                <w:color w:val="000000"/>
+                <w:sz w:val="19"/>
+                <w:szCs w:val="19"/>
+              </w:rPr>
+              <w:t xml:space="preserve">Owen Idehen</w:t>
+            </w:r>
+          </w:p>
+        </w:tc>
+        <w:tc>
+          <w:tcPr>
+            <w:tcW w:type="dxa" w:w="5080"/>
+            <w:tcMar>
+              <w:top w:type="dxa" w:w="80"/>
+              <w:left w:type="dxa" w:w="100"/>
+              <w:bottom w:type="dxa" w:w="80"/>
+              <w:right w:type="dxa" w:w="100"/>
+            </w:tcMar>
+            <w:vAlign w:val="center"/>
+          </w:tcPr>
+          <w:p>
+            <w:r>
+              <w:rPr>
+                <w:b w:val="false"/>
+                <w:bCs w:val="false"/>
+                <w:color w:val="000000"/>
+                <w:sz w:val="19"/>
+                <w:szCs w:val="19"/>
+              </w:rPr>
+              <w:t xml:space="preserve">Security hardening: replaced SAM's bucket-wide S3WritePolicy with a custom statement scoped to s3:PutObject on only the cdr/* and debug/* prefixes. Source commit 9bae2d8.</w:t>
+            </w:r>
+          </w:p>
+        </w:tc>
+      </w:tr>
     </w:tbl>
     <w:p>
       <w:pPr>
@@ -723,35 +821,77 @@
           <w:sz w:val="17"/>
           <w:szCs w:val="17"/>
         </w:rPr>
-        <w:t xml:space="preserve">      - S3WritePolicy:</w:t>
-      </w:r>
-    </w:p>
-    <w:p>
-      <w:pPr>
-        <w:shd w:fill="F2F2F2" w:color="auto" w:val="clear"/>
-        <w:spacing w:after="0" w:before="0" w:line="240"/>
-      </w:pPr>
-      <w:r>
-        <w:rPr>
-          <w:rFonts w:ascii="Consolas" w:cs="Consolas" w:eastAsia="Consolas" w:hAnsi="Consolas"/>
-          <w:sz w:val="17"/>
-          <w:szCs w:val="17"/>
-        </w:rPr>
-        <w:t xml:space="preserve">          BucketName: !Ref CdrBucket</w:t>
-      </w:r>
-    </w:p>
-    <w:p>
-      <w:pPr>
-        <w:shd w:fill="F2F2F2" w:color="auto" w:val="clear"/>
-        <w:spacing w:after="0" w:before="0" w:line="240"/>
-      </w:pPr>
-      <w:r>
-        <w:rPr>
-          <w:rFonts w:ascii="Consolas" w:cs="Consolas" w:eastAsia="Consolas" w:hAnsi="Consolas"/>
-          <w:sz w:val="17"/>
-          <w:szCs w:val="17"/>
-        </w:rPr>
         <w:t xml:space="preserve">      - Statement:</w:t>
+      </w:r>
+    </w:p>
+    <w:p>
+      <w:pPr>
+        <w:shd w:fill="F2F2F2" w:color="auto" w:val="clear"/>
+        <w:spacing w:after="0" w:before="0" w:line="240"/>
+      </w:pPr>
+      <w:r>
+        <w:rPr>
+          <w:rFonts w:ascii="Consolas" w:cs="Consolas" w:eastAsia="Consolas" w:hAnsi="Consolas"/>
+          <w:sz w:val="17"/>
+          <w:szCs w:val="17"/>
+        </w:rPr>
+        <w:t xml:space="preserve">          - Effect: Allow</w:t>
+      </w:r>
+    </w:p>
+    <w:p>
+      <w:pPr>
+        <w:shd w:fill="F2F2F2" w:color="auto" w:val="clear"/>
+        <w:spacing w:after="0" w:before="0" w:line="240"/>
+      </w:pPr>
+      <w:r>
+        <w:rPr>
+          <w:rFonts w:ascii="Consolas" w:cs="Consolas" w:eastAsia="Consolas" w:hAnsi="Consolas"/>
+          <w:sz w:val="17"/>
+          <w:szCs w:val="17"/>
+        </w:rPr>
+        <w:t xml:space="preserve">            Action: s3:PutObject</w:t>
+      </w:r>
+    </w:p>
+    <w:p>
+      <w:pPr>
+        <w:shd w:fill="F2F2F2" w:color="auto" w:val="clear"/>
+        <w:spacing w:after="0" w:before="0" w:line="240"/>
+      </w:pPr>
+      <w:r>
+        <w:rPr>
+          <w:rFonts w:ascii="Consolas" w:cs="Consolas" w:eastAsia="Consolas" w:hAnsi="Consolas"/>
+          <w:sz w:val="17"/>
+          <w:szCs w:val="17"/>
+        </w:rPr>
+        <w:t xml:space="preserve">            Resource:</w:t>
+      </w:r>
+    </w:p>
+    <w:p>
+      <w:pPr>
+        <w:shd w:fill="F2F2F2" w:color="auto" w:val="clear"/>
+        <w:spacing w:after="0" w:before="0" w:line="240"/>
+      </w:pPr>
+      <w:r>
+        <w:rPr>
+          <w:rFonts w:ascii="Consolas" w:cs="Consolas" w:eastAsia="Consolas" w:hAnsi="Consolas"/>
+          <w:sz w:val="17"/>
+          <w:szCs w:val="17"/>
+        </w:rPr>
+        <w:t xml:space="preserve">              - !Sub "${CdrBucket.Arn}/cdr/*"</w:t>
+      </w:r>
+    </w:p>
+    <w:p>
+      <w:pPr>
+        <w:shd w:fill="F2F2F2" w:color="auto" w:val="clear"/>
+        <w:spacing w:after="0" w:before="0" w:line="240"/>
+      </w:pPr>
+      <w:r>
+        <w:rPr>
+          <w:rFonts w:ascii="Consolas" w:cs="Consolas" w:eastAsia="Consolas" w:hAnsi="Consolas"/>
+          <w:sz w:val="17"/>
+          <w:szCs w:val="17"/>
+        </w:rPr>
+        <w:t xml:space="preserve">              - !Sub "${CdrBucket.Arn}/debug/*"</w:t>
       </w:r>
     </w:p>
     <w:p>
@@ -1603,7 +1743,7 @@
           <w:sz w:val="22"/>
           <w:szCs w:val="22"/>
         </w:rPr>
-        <w:t xml:space="preserve">Auto-generated by AWS SAM from the policies above: s3:PutObject (and related write actions) scoped to the CdrBucket; secretsmanager:GetSecretValue scoped to the named secret's ARN pattern; plus the default Lambda basic execution policy (CloudWatch Logs write) SAM always attaches.</w:t>
+        <w:t xml:space="preserve">s3:PutObject scoped to exactly the cdr/* and debug/* prefixes of CdrBucket (not the bucket as a whole — the only action and prefixes the code ever uses); secretsmanager:GetSecretValue scoped to the named secret's ARN pattern; plus the default Lambda basic execution policy (CloudWatch Logs write) SAM always attaches. No broader S3 or Secrets Manager access is granted.</w:t>
       </w:r>
     </w:p>
     <w:p>

</xml_diff>

<commit_message>
Sync architecture diagram and Lambda config doc with recent changes
architecture-summary.html: note durationMs timing on the Lambda
component, describe CdrDownloaderErrorsAlarm's optional Datadog
notification (gated by HasDatadogForwarderTopicArn), and reword the
gap-note to reflect that Datadog alerting is opt-in rather than an
unfinished requirement.

CdrDownloaderFunction-Lambda-Config.docx: regenerated with v1.3-v1.5
version history entries (execution duration timing, the EventBridge
Scheduler switch, and the optional DatadogForwarderTopicArn), updated
template.yaml snapshots (function resource, parameters, new
Conditions/SchedulerInvokeRole/MonthlyCdrDownloadSchedule block,
alarm), and new subsections documenting the scheduler trigger and
duration timing. Source code sections continue to be read live from
src/*.js, so they already reflect the current handler.
</commit_message>
<xml_diff>
--- a/CdrDownloaderFunction-Lambda-Config.docx
+++ b/CdrDownloaderFunction-Lambda-Config.docx
@@ -479,6 +479,300 @@
           </w:p>
         </w:tc>
       </w:tr>
+      <w:tr>
+        <w:tc>
+          <w:tcPr>
+            <w:tcW w:type="dxa" w:w="1200"/>
+            <w:tcMar>
+              <w:top w:type="dxa" w:w="80"/>
+              <w:left w:type="dxa" w:w="100"/>
+              <w:bottom w:type="dxa" w:w="80"/>
+              <w:right w:type="dxa" w:w="100"/>
+            </w:tcMar>
+            <w:vAlign w:val="center"/>
+          </w:tcPr>
+          <w:p>
+            <w:r>
+              <w:rPr>
+                <w:b w:val="false"/>
+                <w:bCs w:val="false"/>
+                <w:color w:val="000000"/>
+                <w:sz w:val="19"/>
+                <w:szCs w:val="19"/>
+              </w:rPr>
+              <w:t xml:space="preserve">1.3</w:t>
+            </w:r>
+          </w:p>
+        </w:tc>
+        <w:tc>
+          <w:tcPr>
+            <w:tcW w:type="dxa" w:w="1600"/>
+            <w:tcMar>
+              <w:top w:type="dxa" w:w="80"/>
+              <w:left w:type="dxa" w:w="100"/>
+              <w:bottom w:type="dxa" w:w="80"/>
+              <w:right w:type="dxa" w:w="100"/>
+            </w:tcMar>
+            <w:vAlign w:val="center"/>
+          </w:tcPr>
+          <w:p>
+            <w:r>
+              <w:rPr>
+                <w:b w:val="false"/>
+                <w:bCs w:val="false"/>
+                <w:color w:val="000000"/>
+                <w:sz w:val="19"/>
+                <w:szCs w:val="19"/>
+              </w:rPr>
+              <w:t xml:space="preserve">2026-09-23</w:t>
+            </w:r>
+          </w:p>
+        </w:tc>
+        <w:tc>
+          <w:tcPr>
+            <w:tcW w:type="dxa" w:w="2200"/>
+            <w:tcMar>
+              <w:top w:type="dxa" w:w="80"/>
+              <w:left w:type="dxa" w:w="100"/>
+              <w:bottom w:type="dxa" w:w="80"/>
+              <w:right w:type="dxa" w:w="100"/>
+            </w:tcMar>
+            <w:vAlign w:val="center"/>
+          </w:tcPr>
+          <w:p>
+            <w:r>
+              <w:rPr>
+                <w:b w:val="false"/>
+                <w:bCs w:val="false"/>
+                <w:color w:val="000000"/>
+                <w:sz w:val="19"/>
+                <w:szCs w:val="19"/>
+              </w:rPr>
+              <w:t xml:space="preserve">Owen Idehen</w:t>
+            </w:r>
+          </w:p>
+        </w:tc>
+        <w:tc>
+          <w:tcPr>
+            <w:tcW w:type="dxa" w:w="5080"/>
+            <w:tcMar>
+              <w:top w:type="dxa" w:w="80"/>
+              <w:left w:type="dxa" w:w="100"/>
+              <w:bottom w:type="dxa" w:w="80"/>
+              <w:right w:type="dxa" w:w="100"/>
+            </w:tcMar>
+            <w:vAlign w:val="center"/>
+          </w:tcPr>
+          <w:p>
+            <w:r>
+              <w:rPr>
+                <w:b w:val="false"/>
+                <w:bCs w:val="false"/>
+                <w:color w:val="000000"/>
+                <w:sz w:val="19"/>
+                <w:szCs w:val="19"/>
+              </w:rPr>
+              <w:t xml:space="preserve">Added execution duration timing: the handler now returns durationMs in its response and logs elapsed time on both success and failure, making it easy to see how long a run took and spot runs approaching the 180s timeout. Source commit dacb73a.</w:t>
+            </w:r>
+          </w:p>
+        </w:tc>
+      </w:tr>
+      <w:tr>
+        <w:tc>
+          <w:tcPr>
+            <w:tcW w:type="dxa" w:w="1200"/>
+            <w:tcMar>
+              <w:top w:type="dxa" w:w="80"/>
+              <w:left w:type="dxa" w:w="100"/>
+              <w:bottom w:type="dxa" w:w="80"/>
+              <w:right w:type="dxa" w:w="100"/>
+            </w:tcMar>
+            <w:vAlign w:val="center"/>
+          </w:tcPr>
+          <w:p>
+            <w:r>
+              <w:rPr>
+                <w:b w:val="false"/>
+                <w:bCs w:val="false"/>
+                <w:color w:val="000000"/>
+                <w:sz w:val="19"/>
+                <w:szCs w:val="19"/>
+              </w:rPr>
+              <w:t xml:space="preserve">1.4</w:t>
+            </w:r>
+          </w:p>
+        </w:tc>
+        <w:tc>
+          <w:tcPr>
+            <w:tcW w:type="dxa" w:w="1600"/>
+            <w:tcMar>
+              <w:top w:type="dxa" w:w="80"/>
+              <w:left w:type="dxa" w:w="100"/>
+              <w:bottom w:type="dxa" w:w="80"/>
+              <w:right w:type="dxa" w:w="100"/>
+            </w:tcMar>
+            <w:vAlign w:val="center"/>
+          </w:tcPr>
+          <w:p>
+            <w:r>
+              <w:rPr>
+                <w:b w:val="false"/>
+                <w:bCs w:val="false"/>
+                <w:color w:val="000000"/>
+                <w:sz w:val="19"/>
+                <w:szCs w:val="19"/>
+              </w:rPr>
+              <w:t xml:space="preserve">2026-09-23</w:t>
+            </w:r>
+          </w:p>
+        </w:tc>
+        <w:tc>
+          <w:tcPr>
+            <w:tcW w:type="dxa" w:w="2200"/>
+            <w:tcMar>
+              <w:top w:type="dxa" w:w="80"/>
+              <w:left w:type="dxa" w:w="100"/>
+              <w:bottom w:type="dxa" w:w="80"/>
+              <w:right w:type="dxa" w:w="100"/>
+            </w:tcMar>
+            <w:vAlign w:val="center"/>
+          </w:tcPr>
+          <w:p>
+            <w:r>
+              <w:rPr>
+                <w:b w:val="false"/>
+                <w:bCs w:val="false"/>
+                <w:color w:val="000000"/>
+                <w:sz w:val="19"/>
+                <w:szCs w:val="19"/>
+              </w:rPr>
+              <w:t xml:space="preserve">Owen Idehen</w:t>
+            </w:r>
+          </w:p>
+        </w:tc>
+        <w:tc>
+          <w:tcPr>
+            <w:tcW w:type="dxa" w:w="5080"/>
+            <w:tcMar>
+              <w:top w:type="dxa" w:w="80"/>
+              <w:left w:type="dxa" w:w="100"/>
+              <w:bottom w:type="dxa" w:w="80"/>
+              <w:right w:type="dxa" w:w="100"/>
+            </w:tcMar>
+            <w:vAlign w:val="center"/>
+          </w:tcPr>
+          <w:p>
+            <w:r>
+              <w:rPr>
+                <w:b w:val="false"/>
+                <w:bCs w:val="false"/>
+                <w:color w:val="000000"/>
+                <w:sz w:val="19"/>
+                <w:szCs w:val="19"/>
+              </w:rPr>
+              <w:t xml:space="preserve">Replaced the classic EventBridge Rule (Schedule event, UTC-only) with AWS EventBridge Scheduler (MonthlyCdrDownloadSchedule + SchedulerInvokeRole), so the monthly trigger stays fixed at a local time (default 09:00 Europe/London) across the GMT/BST transition instead of drifting by an hour. Source commit 83700b3.</w:t>
+            </w:r>
+          </w:p>
+        </w:tc>
+      </w:tr>
+      <w:tr>
+        <w:tc>
+          <w:tcPr>
+            <w:tcW w:type="dxa" w:w="1200"/>
+            <w:tcMar>
+              <w:top w:type="dxa" w:w="80"/>
+              <w:left w:type="dxa" w:w="100"/>
+              <w:bottom w:type="dxa" w:w="80"/>
+              <w:right w:type="dxa" w:w="100"/>
+            </w:tcMar>
+            <w:vAlign w:val="center"/>
+          </w:tcPr>
+          <w:p>
+            <w:r>
+              <w:rPr>
+                <w:b w:val="false"/>
+                <w:bCs w:val="false"/>
+                <w:color w:val="000000"/>
+                <w:sz w:val="19"/>
+                <w:szCs w:val="19"/>
+              </w:rPr>
+              <w:t xml:space="preserve">1.5</w:t>
+            </w:r>
+          </w:p>
+        </w:tc>
+        <w:tc>
+          <w:tcPr>
+            <w:tcW w:type="dxa" w:w="1600"/>
+            <w:tcMar>
+              <w:top w:type="dxa" w:w="80"/>
+              <w:left w:type="dxa" w:w="100"/>
+              <w:bottom w:type="dxa" w:w="80"/>
+              <w:right w:type="dxa" w:w="100"/>
+            </w:tcMar>
+            <w:vAlign w:val="center"/>
+          </w:tcPr>
+          <w:p>
+            <w:r>
+              <w:rPr>
+                <w:b w:val="false"/>
+                <w:bCs w:val="false"/>
+                <w:color w:val="000000"/>
+                <w:sz w:val="19"/>
+                <w:szCs w:val="19"/>
+              </w:rPr>
+              <w:t xml:space="preserve">2026-09-23</w:t>
+            </w:r>
+          </w:p>
+        </w:tc>
+        <w:tc>
+          <w:tcPr>
+            <w:tcW w:type="dxa" w:w="2200"/>
+            <w:tcMar>
+              <w:top w:type="dxa" w:w="80"/>
+              <w:left w:type="dxa" w:w="100"/>
+              <w:bottom w:type="dxa" w:w="80"/>
+              <w:right w:type="dxa" w:w="100"/>
+            </w:tcMar>
+            <w:vAlign w:val="center"/>
+          </w:tcPr>
+          <w:p>
+            <w:r>
+              <w:rPr>
+                <w:b w:val="false"/>
+                <w:bCs w:val="false"/>
+                <w:color w:val="000000"/>
+                <w:sz w:val="19"/>
+                <w:szCs w:val="19"/>
+              </w:rPr>
+              <w:t xml:space="preserve">Owen Idehen</w:t>
+            </w:r>
+          </w:p>
+        </w:tc>
+        <w:tc>
+          <w:tcPr>
+            <w:tcW w:type="dxa" w:w="5080"/>
+            <w:tcMar>
+              <w:top w:type="dxa" w:w="80"/>
+              <w:left w:type="dxa" w:w="100"/>
+              <w:bottom w:type="dxa" w:w="80"/>
+              <w:right w:type="dxa" w:w="100"/>
+            </w:tcMar>
+            <w:vAlign w:val="center"/>
+          </w:tcPr>
+          <w:p>
+            <w:r>
+              <w:rPr>
+                <w:b w:val="false"/>
+                <w:bCs w:val="false"/>
+                <w:color w:val="000000"/>
+                <w:sz w:val="19"/>
+                <w:szCs w:val="19"/>
+              </w:rPr>
+              <w:t xml:space="preserve">Made DatadogForwarderTopicArn optional: it now defaults to an empty string, and a new HasDatadogForwarderTopicArn condition gates the alarm's AlarmActions/OKActions, so the stack deploys cleanly before a Datadog Forwarder exists. Source commit c09472a.</w:t>
+            </w:r>
+          </w:p>
+        </w:tc>
+      </w:tr>
     </w:tbl>
     <w:p>
       <w:pPr>
@@ -924,118 +1218,6 @@
     </w:p>
     <w:p>
       <w:pPr>
-        <w:shd w:fill="F2F2F2" w:color="auto" w:val="clear"/>
-        <w:spacing w:after="0" w:before="0" w:line="240"/>
-      </w:pPr>
-      <w:r>
-        <w:rPr>
-          <w:rFonts w:ascii="Consolas" w:cs="Consolas" w:eastAsia="Consolas" w:hAnsi="Consolas"/>
-          <w:sz w:val="17"/>
-          <w:szCs w:val="17"/>
-        </w:rPr>
-        <w:t xml:space="preserve">            Resource: !Sub "arn:${AWS::Partition}:secretsmanager:${AWS::Region}:${AWS::AccountId}:secret:${CredentialsSecretName}*"</w:t>
-      </w:r>
-    </w:p>
-    <w:p>
-      <w:pPr>
-        <w:shd w:fill="F2F2F2" w:color="auto" w:val="clear"/>
-        <w:spacing w:after="0" w:before="0" w:line="240"/>
-      </w:pPr>
-      <w:r>
-        <w:rPr>
-          <w:rFonts w:ascii="Consolas" w:cs="Consolas" w:eastAsia="Consolas" w:hAnsi="Consolas"/>
-          <w:sz w:val="17"/>
-          <w:szCs w:val="17"/>
-        </w:rPr>
-        <w:t xml:space="preserve">    Events:</w:t>
-      </w:r>
-    </w:p>
-    <w:p>
-      <w:pPr>
-        <w:shd w:fill="F2F2F2" w:color="auto" w:val="clear"/>
-        <w:spacing w:after="0" w:before="0" w:line="240"/>
-      </w:pPr>
-      <w:r>
-        <w:rPr>
-          <w:rFonts w:ascii="Consolas" w:cs="Consolas" w:eastAsia="Consolas" w:hAnsi="Consolas"/>
-          <w:sz w:val="17"/>
-          <w:szCs w:val="17"/>
-        </w:rPr>
-        <w:t xml:space="preserve">      MonthlySchedule:</w:t>
-      </w:r>
-    </w:p>
-    <w:p>
-      <w:pPr>
-        <w:shd w:fill="F2F2F2" w:color="auto" w:val="clear"/>
-        <w:spacing w:after="0" w:before="0" w:line="240"/>
-      </w:pPr>
-      <w:r>
-        <w:rPr>
-          <w:rFonts w:ascii="Consolas" w:cs="Consolas" w:eastAsia="Consolas" w:hAnsi="Consolas"/>
-          <w:sz w:val="17"/>
-          <w:szCs w:val="17"/>
-        </w:rPr>
-        <w:t xml:space="preserve">        Type: Schedule</w:t>
-      </w:r>
-    </w:p>
-    <w:p>
-      <w:pPr>
-        <w:shd w:fill="F2F2F2" w:color="auto" w:val="clear"/>
-        <w:spacing w:after="0" w:before="0" w:line="240"/>
-      </w:pPr>
-      <w:r>
-        <w:rPr>
-          <w:rFonts w:ascii="Consolas" w:cs="Consolas" w:eastAsia="Consolas" w:hAnsi="Consolas"/>
-          <w:sz w:val="17"/>
-          <w:szCs w:val="17"/>
-        </w:rPr>
-        <w:t xml:space="preserve">        Properties:</w:t>
-      </w:r>
-    </w:p>
-    <w:p>
-      <w:pPr>
-        <w:shd w:fill="F2F2F2" w:color="auto" w:val="clear"/>
-        <w:spacing w:after="0" w:before="0" w:line="240"/>
-      </w:pPr>
-      <w:r>
-        <w:rPr>
-          <w:rFonts w:ascii="Consolas" w:cs="Consolas" w:eastAsia="Consolas" w:hAnsi="Consolas"/>
-          <w:sz w:val="17"/>
-          <w:szCs w:val="17"/>
-        </w:rPr>
-        <w:t xml:space="preserve">          Schedule: !Ref ScheduleExpression</w:t>
-      </w:r>
-    </w:p>
-    <w:p>
-      <w:pPr>
-        <w:shd w:fill="F2F2F2" w:color="auto" w:val="clear"/>
-        <w:spacing w:after="0" w:before="0" w:line="240"/>
-      </w:pPr>
-      <w:r>
-        <w:rPr>
-          <w:rFonts w:ascii="Consolas" w:cs="Consolas" w:eastAsia="Consolas" w:hAnsi="Consolas"/>
-          <w:sz w:val="17"/>
-          <w:szCs w:val="17"/>
-        </w:rPr>
-        <w:t xml:space="preserve">          Name: !Sub "${AWS::StackName}-monthly-cdr-download"</w:t>
-      </w:r>
-    </w:p>
-    <w:p>
-      <w:pPr>
-        <w:shd w:fill="F2F2F2" w:color="auto" w:val="clear"/>
-        <w:spacing w:after="0" w:before="0" w:line="240"/>
-      </w:pPr>
-      <w:r>
-        <w:rPr>
-          <w:rFonts w:ascii="Consolas" w:cs="Consolas" w:eastAsia="Consolas" w:hAnsi="Consolas"/>
-          <w:sz w:val="17"/>
-          <w:szCs w:val="17"/>
-        </w:rPr>
-        <w:t xml:space="preserve">          Description: Triggers the CDR download on the 1st of every month</w:t>
-      </w:r>
-    </w:p>
-    <w:p>
-      <w:pPr>
         <w:pBdr>
           <w:bottom w:val="single" w:color="CCCCCC" w:sz="4"/>
         </w:pBdr>
@@ -1048,7 +1230,7 @@
           <w:sz w:val="17"/>
           <w:szCs w:val="17"/>
         </w:rPr>
-        <w:t xml:space="preserve">          Enabled: true</w:t>
+        <w:t xml:space="preserve">            Resource: !Sub "arn:${AWS::Partition}:secretsmanager:${AWS::Region}:${AWS::AccountId}:secret:${CredentialsSecretName}*"</w:t>
       </w:r>
     </w:p>
     <w:p>
@@ -1102,21 +1284,105 @@
           <w:sz w:val="17"/>
           <w:szCs w:val="17"/>
         </w:rPr>
-        <w:t xml:space="preserve">  Default: "cron(0 3 1 * ? *)"</w:t>
-      </w:r>
-    </w:p>
-    <w:p>
-      <w:pPr>
-        <w:shd w:fill="F2F2F2" w:color="auto" w:val="clear"/>
-        <w:spacing w:after="0" w:before="0" w:line="240"/>
-      </w:pPr>
-      <w:r>
-        <w:rPr>
-          <w:rFonts w:ascii="Consolas" w:cs="Consolas" w:eastAsia="Consolas" w:hAnsi="Consolas"/>
-          <w:sz w:val="17"/>
-          <w:szCs w:val="17"/>
-        </w:rPr>
-        <w:t xml:space="preserve">  Description: 03:00 UTC on the 1st of every month.</w:t>
+        <w:t xml:space="preserve">  Default: "cron(0 9 1 * ? *)"</w:t>
+      </w:r>
+    </w:p>
+    <w:p>
+      <w:pPr>
+        <w:shd w:fill="F2F2F2" w:color="auto" w:val="clear"/>
+        <w:spacing w:after="0" w:before="0" w:line="240"/>
+      </w:pPr>
+      <w:r>
+        <w:rPr>
+          <w:rFonts w:ascii="Consolas" w:cs="Consolas" w:eastAsia="Consolas" w:hAnsi="Consolas"/>
+          <w:sz w:val="17"/>
+          <w:szCs w:val="17"/>
+        </w:rPr>
+        <w:t xml:space="preserve">  Description: &gt;</w:t>
+      </w:r>
+    </w:p>
+    <w:p>
+      <w:pPr>
+        <w:shd w:fill="F2F2F2" w:color="auto" w:val="clear"/>
+        <w:spacing w:after="0" w:before="0" w:line="240"/>
+      </w:pPr>
+      <w:r>
+        <w:rPr>
+          <w:rFonts w:ascii="Consolas" w:cs="Consolas" w:eastAsia="Consolas" w:hAnsi="Consolas"/>
+          <w:sz w:val="17"/>
+          <w:szCs w:val="17"/>
+        </w:rPr>
+        <w:t xml:space="preserve">    When the download job runs, evaluated in the timezone named by</w:t>
+      </w:r>
+    </w:p>
+    <w:p>
+      <w:pPr>
+        <w:shd w:fill="F2F2F2" w:color="auto" w:val="clear"/>
+        <w:spacing w:after="0" w:before="0" w:line="240"/>
+      </w:pPr>
+      <w:r>
+        <w:rPr>
+          <w:rFonts w:ascii="Consolas" w:cs="Consolas" w:eastAsia="Consolas" w:hAnsi="Consolas"/>
+          <w:sz w:val="17"/>
+          <w:szCs w:val="17"/>
+        </w:rPr>
+        <w:t xml:space="preserve">    ScheduleTimezone (not UTC). Default is 09:00 on the 1st of every</w:t>
+      </w:r>
+    </w:p>
+    <w:p>
+      <w:pPr>
+        <w:shd w:fill="F2F2F2" w:color="auto" w:val="clear"/>
+        <w:spacing w:after="0" w:before="0" w:line="240"/>
+      </w:pPr>
+      <w:r>
+        <w:rPr>
+          <w:rFonts w:ascii="Consolas" w:cs="Consolas" w:eastAsia="Consolas" w:hAnsi="Consolas"/>
+          <w:sz w:val="17"/>
+          <w:szCs w:val="17"/>
+        </w:rPr>
+        <w:t xml:space="preserve">    month. Runs via AWS EventBridge Scheduler rather than a classic</w:t>
+      </w:r>
+    </w:p>
+    <w:p>
+      <w:pPr>
+        <w:shd w:fill="F2F2F2" w:color="auto" w:val="clear"/>
+        <w:spacing w:after="0" w:before="0" w:line="240"/>
+      </w:pPr>
+      <w:r>
+        <w:rPr>
+          <w:rFonts w:ascii="Consolas" w:cs="Consolas" w:eastAsia="Consolas" w:hAnsi="Consolas"/>
+          <w:sz w:val="17"/>
+          <w:szCs w:val="17"/>
+        </w:rPr>
+        <w:t xml:space="preserve">    EventBridge Rule specifically so this can be a fixed local time —</w:t>
+      </w:r>
+    </w:p>
+    <w:p>
+      <w:pPr>
+        <w:shd w:fill="F2F2F2" w:color="auto" w:val="clear"/>
+        <w:spacing w:after="0" w:before="0" w:line="240"/>
+      </w:pPr>
+      <w:r>
+        <w:rPr>
+          <w:rFonts w:ascii="Consolas" w:cs="Consolas" w:eastAsia="Consolas" w:hAnsi="Consolas"/>
+          <w:sz w:val="17"/>
+          <w:szCs w:val="17"/>
+        </w:rPr>
+        <w:t xml:space="preserve">    classic EventBridge cron rules are UTC-only and have no</w:t>
+      </w:r>
+    </w:p>
+    <w:p>
+      <w:pPr>
+        <w:shd w:fill="F2F2F2" w:color="auto" w:val="clear"/>
+        <w:spacing w:after="0" w:before="0" w:line="240"/>
+      </w:pPr>
+      <w:r>
+        <w:rPr>
+          <w:rFonts w:ascii="Consolas" w:cs="Consolas" w:eastAsia="Consolas" w:hAnsi="Consolas"/>
+          <w:sz w:val="17"/>
+          <w:szCs w:val="17"/>
+        </w:rPr>
+        <w:t xml:space="preserve">    daylight-saving awareness.</w:t>
       </w:r>
     </w:p>
     <w:p>
@@ -1144,6 +1410,132 @@
           <w:sz w:val="17"/>
           <w:szCs w:val="17"/>
         </w:rPr>
+        <w:t xml:space="preserve">ScheduleTimezone:</w:t>
+      </w:r>
+    </w:p>
+    <w:p>
+      <w:pPr>
+        <w:shd w:fill="F2F2F2" w:color="auto" w:val="clear"/>
+        <w:spacing w:after="0" w:before="0" w:line="240"/>
+      </w:pPr>
+      <w:r>
+        <w:rPr>
+          <w:rFonts w:ascii="Consolas" w:cs="Consolas" w:eastAsia="Consolas" w:hAnsi="Consolas"/>
+          <w:sz w:val="17"/>
+          <w:szCs w:val="17"/>
+        </w:rPr>
+        <w:t xml:space="preserve">  Type: String</w:t>
+      </w:r>
+    </w:p>
+    <w:p>
+      <w:pPr>
+        <w:shd w:fill="F2F2F2" w:color="auto" w:val="clear"/>
+        <w:spacing w:after="0" w:before="0" w:line="240"/>
+      </w:pPr>
+      <w:r>
+        <w:rPr>
+          <w:rFonts w:ascii="Consolas" w:cs="Consolas" w:eastAsia="Consolas" w:hAnsi="Consolas"/>
+          <w:sz w:val="17"/>
+          <w:szCs w:val="17"/>
+        </w:rPr>
+        <w:t xml:space="preserve">  Default: "Europe/London"</w:t>
+      </w:r>
+    </w:p>
+    <w:p>
+      <w:pPr>
+        <w:shd w:fill="F2F2F2" w:color="auto" w:val="clear"/>
+        <w:spacing w:after="0" w:before="0" w:line="240"/>
+      </w:pPr>
+      <w:r>
+        <w:rPr>
+          <w:rFonts w:ascii="Consolas" w:cs="Consolas" w:eastAsia="Consolas" w:hAnsi="Consolas"/>
+          <w:sz w:val="17"/>
+          <w:szCs w:val="17"/>
+        </w:rPr>
+        <w:t xml:space="preserve">  Description: &gt;</w:t>
+      </w:r>
+    </w:p>
+    <w:p>
+      <w:pPr>
+        <w:shd w:fill="F2F2F2" w:color="auto" w:val="clear"/>
+        <w:spacing w:after="0" w:before="0" w:line="240"/>
+      </w:pPr>
+      <w:r>
+        <w:rPr>
+          <w:rFonts w:ascii="Consolas" w:cs="Consolas" w:eastAsia="Consolas" w:hAnsi="Consolas"/>
+          <w:sz w:val="17"/>
+          <w:szCs w:val="17"/>
+        </w:rPr>
+        <w:t xml:space="preserve">    IANA timezone ScheduleExpression is evaluated in. EventBridge</w:t>
+      </w:r>
+    </w:p>
+    <w:p>
+      <w:pPr>
+        <w:shd w:fill="F2F2F2" w:color="auto" w:val="clear"/>
+        <w:spacing w:after="0" w:before="0" w:line="240"/>
+      </w:pPr>
+      <w:r>
+        <w:rPr>
+          <w:rFonts w:ascii="Consolas" w:cs="Consolas" w:eastAsia="Consolas" w:hAnsi="Consolas"/>
+          <w:sz w:val="17"/>
+          <w:szCs w:val="17"/>
+        </w:rPr>
+        <w:t xml:space="preserve">    Scheduler applies daylight-saving transitions for this zone</w:t>
+      </w:r>
+    </w:p>
+    <w:p>
+      <w:pPr>
+        <w:shd w:fill="F2F2F2" w:color="auto" w:val="clear"/>
+        <w:spacing w:after="0" w:before="0" w:line="240"/>
+      </w:pPr>
+      <w:r>
+        <w:rPr>
+          <w:rFonts w:ascii="Consolas" w:cs="Consolas" w:eastAsia="Consolas" w:hAnsi="Consolas"/>
+          <w:sz w:val="17"/>
+          <w:szCs w:val="17"/>
+        </w:rPr>
+        <w:t xml:space="preserve">    automatically, so the default keeps the run fixed at 09:00 UK local</w:t>
+      </w:r>
+    </w:p>
+    <w:p>
+      <w:pPr>
+        <w:shd w:fill="F2F2F2" w:color="auto" w:val="clear"/>
+        <w:spacing w:after="0" w:before="0" w:line="240"/>
+      </w:pPr>
+      <w:r>
+        <w:rPr>
+          <w:rFonts w:ascii="Consolas" w:cs="Consolas" w:eastAsia="Consolas" w:hAnsi="Consolas"/>
+          <w:sz w:val="17"/>
+          <w:szCs w:val="17"/>
+        </w:rPr>
+        <w:t xml:space="preserve">    time year-round (09:00 GMT in winter, 09:00 BST in summer).</w:t>
+      </w:r>
+    </w:p>
+    <w:p>
+      <w:pPr>
+        <w:shd w:fill="F2F2F2" w:color="auto" w:val="clear"/>
+        <w:spacing w:after="0" w:before="0" w:line="240"/>
+      </w:pPr>
+      <w:r>
+        <w:rPr>
+          <w:rFonts w:ascii="Consolas" w:cs="Consolas" w:eastAsia="Consolas" w:hAnsi="Consolas"/>
+          <w:sz w:val="17"/>
+          <w:szCs w:val="17"/>
+        </w:rPr>
+        <w:t xml:space="preserve"> </w:t>
+      </w:r>
+    </w:p>
+    <w:p>
+      <w:pPr>
+        <w:shd w:fill="F2F2F2" w:color="auto" w:val="clear"/>
+        <w:spacing w:after="0" w:before="0" w:line="240"/>
+      </w:pPr>
+      <w:r>
+        <w:rPr>
+          <w:rFonts w:ascii="Consolas" w:cs="Consolas" w:eastAsia="Consolas" w:hAnsi="Consolas"/>
+          <w:sz w:val="17"/>
+          <w:szCs w:val="17"/>
+        </w:rPr>
         <w:t xml:space="preserve">CredentialsSecretName:</w:t>
       </w:r>
     </w:p>
@@ -1382,7 +1774,21 @@
           <w:sz w:val="17"/>
           <w:szCs w:val="17"/>
         </w:rPr>
-        <w:t xml:space="preserve">  AllowedPattern: "^arn:aws[a-zA-Z-]*:sns:[a-z0-9-]+:\\d{12}:.+$"</w:t>
+        <w:t xml:space="preserve">  Default: ""</w:t>
+      </w:r>
+    </w:p>
+    <w:p>
+      <w:pPr>
+        <w:shd w:fill="F2F2F2" w:color="auto" w:val="clear"/>
+        <w:spacing w:after="0" w:before="0" w:line="240"/>
+      </w:pPr>
+      <w:r>
+        <w:rPr>
+          <w:rFonts w:ascii="Consolas" w:cs="Consolas" w:eastAsia="Consolas" w:hAnsi="Consolas"/>
+          <w:sz w:val="17"/>
+          <w:szCs w:val="17"/>
+        </w:rPr>
+        <w:t xml:space="preserve">  AllowedPattern: "^$|^arn:aws[a-zA-Z-]*:sns:[a-z0-9-]+:\\d{12}:.+$"</w:t>
       </w:r>
     </w:p>
     <w:p>
@@ -1410,21 +1816,35 @@
           <w:sz w:val="17"/>
           <w:szCs w:val="17"/>
         </w:rPr>
-        <w:t xml:space="preserve">    ARN of the existing Datadog Forwarder's SNS topic. The CloudWatch</w:t>
-      </w:r>
-    </w:p>
-    <w:p>
-      <w:pPr>
-        <w:shd w:fill="F2F2F2" w:color="auto" w:val="clear"/>
-        <w:spacing w:after="0" w:before="0" w:line="240"/>
-      </w:pPr>
-      <w:r>
-        <w:rPr>
-          <w:rFonts w:ascii="Consolas" w:cs="Consolas" w:eastAsia="Consolas" w:hAnsi="Consolas"/>
-          <w:sz w:val="17"/>
-          <w:szCs w:val="17"/>
-        </w:rPr>
-        <w:t xml:space="preserve">    alarm on this function's Errors metric publishes its ALARM/OK state</w:t>
+        <w:t xml:space="preserve">    ARN of the Datadog Forwarder's SNS topic. Optional — leave empty</w:t>
+      </w:r>
+    </w:p>
+    <w:p>
+      <w:pPr>
+        <w:shd w:fill="F2F2F2" w:color="auto" w:val="clear"/>
+        <w:spacing w:after="0" w:before="0" w:line="240"/>
+      </w:pPr>
+      <w:r>
+        <w:rPr>
+          <w:rFonts w:ascii="Consolas" w:cs="Consolas" w:eastAsia="Consolas" w:hAnsi="Consolas"/>
+          <w:sz w:val="17"/>
+          <w:szCs w:val="17"/>
+        </w:rPr>
+        <w:t xml:space="preserve">    (the default) to deploy without Datadog alerting; the CloudWatch</w:t>
+      </w:r>
+    </w:p>
+    <w:p>
+      <w:pPr>
+        <w:shd w:fill="F2F2F2" w:color="auto" w:val="clear"/>
+        <w:spacing w:after="0" w:before="0" w:line="240"/>
+      </w:pPr>
+      <w:r>
+        <w:rPr>
+          <w:rFonts w:ascii="Consolas" w:cs="Consolas" w:eastAsia="Consolas" w:hAnsi="Consolas"/>
+          <w:sz w:val="17"/>
+          <w:szCs w:val="17"/>
+        </w:rPr>
+        <w:t xml:space="preserve">    alarm still exists, it just has no AlarmActions/OKActions until</w:t>
       </w:r>
     </w:p>
     <w:p>
@@ -1441,7 +1861,7 @@
           <w:sz w:val="17"/>
           <w:szCs w:val="17"/>
         </w:rPr>
-        <w:t xml:space="preserve">    changes here so Datadog picks them up as monitor events.</w:t>
+        <w:t xml:space="preserve">    this is set.</w:t>
       </w:r>
     </w:p>
     <w:p>
@@ -1450,7 +1870,19 @@
         <w:spacing w:after="120" w:before="240"/>
       </w:pPr>
       <w:r>
-        <w:t xml:space="preserve">1.3 CloudWatch alarm (Datadog alerting)</w:t>
+        <w:t xml:space="preserve">1.3 Trigger: AWS EventBridge Scheduler (new in v1.4)</w:t>
+      </w:r>
+    </w:p>
+    <w:p>
+      <w:pPr>
+        <w:spacing w:after="200" w:before="0"/>
+      </w:pPr>
+      <w:r>
+        <w:rPr>
+          <w:sz w:val="22"/>
+          <w:szCs w:val="22"/>
+        </w:rPr>
+        <w:t xml:space="preserve">Classic EventBridge Rule cron expressions are fixed UTC with no daylight-saving awareness, so a UTC cron drifted an hour off UK local time for half the year. MonthlyCdrDownloadSchedule (an AWS::Scheduler::Schedule resource) evaluates ScheduleExpression in the ScheduleTimezone parameter instead, so the default 09:00 run stays fixed at UK local time year-round. Scheduler invokes the function directly using SchedulerInvokeRole's identity-based lambda:InvokeFunction permission, rather than the resource-based Lambda::Permission a classic EventBridge Rule would need.</w:t>
       </w:r>
     </w:p>
     <w:p>
@@ -1467,245 +1899,469 @@
           <w:sz w:val="17"/>
           <w:szCs w:val="17"/>
         </w:rPr>
-        <w:t xml:space="preserve">CdrDownloaderErrorsAlarm:</w:t>
-      </w:r>
-    </w:p>
-    <w:p>
-      <w:pPr>
-        <w:shd w:fill="F2F2F2" w:color="auto" w:val="clear"/>
-        <w:spacing w:after="0" w:before="0" w:line="240"/>
-      </w:pPr>
-      <w:r>
-        <w:rPr>
-          <w:rFonts w:ascii="Consolas" w:cs="Consolas" w:eastAsia="Consolas" w:hAnsi="Consolas"/>
-          <w:sz w:val="17"/>
-          <w:szCs w:val="17"/>
-        </w:rPr>
-        <w:t xml:space="preserve">  Type: AWS::CloudWatch::Alarm</w:t>
-      </w:r>
-    </w:p>
-    <w:p>
-      <w:pPr>
-        <w:shd w:fill="F2F2F2" w:color="auto" w:val="clear"/>
-        <w:spacing w:after="0" w:before="0" w:line="240"/>
-      </w:pPr>
-      <w:r>
-        <w:rPr>
-          <w:rFonts w:ascii="Consolas" w:cs="Consolas" w:eastAsia="Consolas" w:hAnsi="Consolas"/>
-          <w:sz w:val="17"/>
-          <w:szCs w:val="17"/>
-        </w:rPr>
-        <w:t xml:space="preserve">  Properties:</w:t>
-      </w:r>
-    </w:p>
-    <w:p>
-      <w:pPr>
-        <w:shd w:fill="F2F2F2" w:color="auto" w:val="clear"/>
-        <w:spacing w:after="0" w:before="0" w:line="240"/>
-      </w:pPr>
-      <w:r>
-        <w:rPr>
-          <w:rFonts w:ascii="Consolas" w:cs="Consolas" w:eastAsia="Consolas" w:hAnsi="Consolas"/>
-          <w:sz w:val="17"/>
-          <w:szCs w:val="17"/>
-        </w:rPr>
-        <w:t xml:space="preserve">    AlarmName: !Sub "${AWS::StackName}-lambda-errors"</w:t>
-      </w:r>
-    </w:p>
-    <w:p>
-      <w:pPr>
-        <w:shd w:fill="F2F2F2" w:color="auto" w:val="clear"/>
-        <w:spacing w:after="0" w:before="0" w:line="240"/>
-      </w:pPr>
-      <w:r>
-        <w:rPr>
-          <w:rFonts w:ascii="Consolas" w:cs="Consolas" w:eastAsia="Consolas" w:hAnsi="Consolas"/>
-          <w:sz w:val="17"/>
-          <w:szCs w:val="17"/>
-        </w:rPr>
-        <w:t xml:space="preserve">    Namespace: AWS/Lambda</w:t>
-      </w:r>
-    </w:p>
-    <w:p>
-      <w:pPr>
-        <w:shd w:fill="F2F2F2" w:color="auto" w:val="clear"/>
-        <w:spacing w:after="0" w:before="0" w:line="240"/>
-      </w:pPr>
-      <w:r>
-        <w:rPr>
-          <w:rFonts w:ascii="Consolas" w:cs="Consolas" w:eastAsia="Consolas" w:hAnsi="Consolas"/>
-          <w:sz w:val="17"/>
-          <w:szCs w:val="17"/>
-        </w:rPr>
-        <w:t xml:space="preserve">    MetricName: Errors</w:t>
-      </w:r>
-    </w:p>
-    <w:p>
-      <w:pPr>
-        <w:shd w:fill="F2F2F2" w:color="auto" w:val="clear"/>
-        <w:spacing w:after="0" w:before="0" w:line="240"/>
-      </w:pPr>
-      <w:r>
-        <w:rPr>
-          <w:rFonts w:ascii="Consolas" w:cs="Consolas" w:eastAsia="Consolas" w:hAnsi="Consolas"/>
-          <w:sz w:val="17"/>
-          <w:szCs w:val="17"/>
-        </w:rPr>
-        <w:t xml:space="preserve">    Dimensions:</w:t>
-      </w:r>
-    </w:p>
-    <w:p>
-      <w:pPr>
-        <w:shd w:fill="F2F2F2" w:color="auto" w:val="clear"/>
-        <w:spacing w:after="0" w:before="0" w:line="240"/>
-      </w:pPr>
-      <w:r>
-        <w:rPr>
-          <w:rFonts w:ascii="Consolas" w:cs="Consolas" w:eastAsia="Consolas" w:hAnsi="Consolas"/>
-          <w:sz w:val="17"/>
-          <w:szCs w:val="17"/>
-        </w:rPr>
-        <w:t xml:space="preserve">      - Name: FunctionName</w:t>
-      </w:r>
-    </w:p>
-    <w:p>
-      <w:pPr>
-        <w:shd w:fill="F2F2F2" w:color="auto" w:val="clear"/>
-        <w:spacing w:after="0" w:before="0" w:line="240"/>
-      </w:pPr>
-      <w:r>
-        <w:rPr>
-          <w:rFonts w:ascii="Consolas" w:cs="Consolas" w:eastAsia="Consolas" w:hAnsi="Consolas"/>
-          <w:sz w:val="17"/>
-          <w:szCs w:val="17"/>
-        </w:rPr>
-        <w:t xml:space="preserve">        Value: !Ref CdrDownloaderFunction</w:t>
-      </w:r>
-    </w:p>
-    <w:p>
-      <w:pPr>
-        <w:shd w:fill="F2F2F2" w:color="auto" w:val="clear"/>
-        <w:spacing w:after="0" w:before="0" w:line="240"/>
-      </w:pPr>
-      <w:r>
-        <w:rPr>
-          <w:rFonts w:ascii="Consolas" w:cs="Consolas" w:eastAsia="Consolas" w:hAnsi="Consolas"/>
-          <w:sz w:val="17"/>
-          <w:szCs w:val="17"/>
-        </w:rPr>
-        <w:t xml:space="preserve">    Statistic: Sum</w:t>
-      </w:r>
-    </w:p>
-    <w:p>
-      <w:pPr>
-        <w:shd w:fill="F2F2F2" w:color="auto" w:val="clear"/>
-        <w:spacing w:after="0" w:before="0" w:line="240"/>
-      </w:pPr>
-      <w:r>
-        <w:rPr>
-          <w:rFonts w:ascii="Consolas" w:cs="Consolas" w:eastAsia="Consolas" w:hAnsi="Consolas"/>
-          <w:sz w:val="17"/>
-          <w:szCs w:val="17"/>
-        </w:rPr>
-        <w:t xml:space="preserve">    Period: 86400</w:t>
-      </w:r>
-    </w:p>
-    <w:p>
-      <w:pPr>
-        <w:shd w:fill="F2F2F2" w:color="auto" w:val="clear"/>
-        <w:spacing w:after="0" w:before="0" w:line="240"/>
-      </w:pPr>
-      <w:r>
-        <w:rPr>
-          <w:rFonts w:ascii="Consolas" w:cs="Consolas" w:eastAsia="Consolas" w:hAnsi="Consolas"/>
-          <w:sz w:val="17"/>
-          <w:szCs w:val="17"/>
-        </w:rPr>
-        <w:t xml:space="preserve">    EvaluationPeriods: 1</w:t>
-      </w:r>
-    </w:p>
-    <w:p>
-      <w:pPr>
-        <w:shd w:fill="F2F2F2" w:color="auto" w:val="clear"/>
-        <w:spacing w:after="0" w:before="0" w:line="240"/>
-      </w:pPr>
-      <w:r>
-        <w:rPr>
-          <w:rFonts w:ascii="Consolas" w:cs="Consolas" w:eastAsia="Consolas" w:hAnsi="Consolas"/>
-          <w:sz w:val="17"/>
-          <w:szCs w:val="17"/>
-        </w:rPr>
-        <w:t xml:space="preserve">    Threshold: 0</w:t>
-      </w:r>
-    </w:p>
-    <w:p>
-      <w:pPr>
-        <w:shd w:fill="F2F2F2" w:color="auto" w:val="clear"/>
-        <w:spacing w:after="0" w:before="0" w:line="240"/>
-      </w:pPr>
-      <w:r>
-        <w:rPr>
-          <w:rFonts w:ascii="Consolas" w:cs="Consolas" w:eastAsia="Consolas" w:hAnsi="Consolas"/>
-          <w:sz w:val="17"/>
-          <w:szCs w:val="17"/>
-        </w:rPr>
-        <w:t xml:space="preserve">    ComparisonOperator: GreaterThanThreshold</w:t>
-      </w:r>
-    </w:p>
-    <w:p>
-      <w:pPr>
-        <w:shd w:fill="F2F2F2" w:color="auto" w:val="clear"/>
-        <w:spacing w:after="0" w:before="0" w:line="240"/>
-      </w:pPr>
-      <w:r>
-        <w:rPr>
-          <w:rFonts w:ascii="Consolas" w:cs="Consolas" w:eastAsia="Consolas" w:hAnsi="Consolas"/>
-          <w:sz w:val="17"/>
-          <w:szCs w:val="17"/>
-        </w:rPr>
-        <w:t xml:space="preserve">    TreatMissingData: notBreaching</w:t>
-      </w:r>
-    </w:p>
-    <w:p>
-      <w:pPr>
-        <w:shd w:fill="F2F2F2" w:color="auto" w:val="clear"/>
-        <w:spacing w:after="0" w:before="0" w:line="240"/>
-      </w:pPr>
-      <w:r>
-        <w:rPr>
-          <w:rFonts w:ascii="Consolas" w:cs="Consolas" w:eastAsia="Consolas" w:hAnsi="Consolas"/>
-          <w:sz w:val="17"/>
-          <w:szCs w:val="17"/>
-        </w:rPr>
-        <w:t xml:space="preserve">    AlarmActions:</w:t>
-      </w:r>
-    </w:p>
-    <w:p>
-      <w:pPr>
-        <w:shd w:fill="F2F2F2" w:color="auto" w:val="clear"/>
-        <w:spacing w:after="0" w:before="0" w:line="240"/>
-      </w:pPr>
-      <w:r>
-        <w:rPr>
-          <w:rFonts w:ascii="Consolas" w:cs="Consolas" w:eastAsia="Consolas" w:hAnsi="Consolas"/>
-          <w:sz w:val="17"/>
-          <w:szCs w:val="17"/>
-        </w:rPr>
-        <w:t xml:space="preserve">      - !Ref DatadogForwarderTopicArn</w:t>
-      </w:r>
-    </w:p>
-    <w:p>
-      <w:pPr>
-        <w:shd w:fill="F2F2F2" w:color="auto" w:val="clear"/>
-        <w:spacing w:after="0" w:before="0" w:line="240"/>
-      </w:pPr>
-      <w:r>
-        <w:rPr>
-          <w:rFonts w:ascii="Consolas" w:cs="Consolas" w:eastAsia="Consolas" w:hAnsi="Consolas"/>
-          <w:sz w:val="17"/>
-          <w:szCs w:val="17"/>
-        </w:rPr>
-        <w:t xml:space="preserve">    OKActions:</w:t>
+        <w:t xml:space="preserve">Conditions:</w:t>
+      </w:r>
+    </w:p>
+    <w:p>
+      <w:pPr>
+        <w:shd w:fill="F2F2F2" w:color="auto" w:val="clear"/>
+        <w:spacing w:after="0" w:before="0" w:line="240"/>
+      </w:pPr>
+      <w:r>
+        <w:rPr>
+          <w:rFonts w:ascii="Consolas" w:cs="Consolas" w:eastAsia="Consolas" w:hAnsi="Consolas"/>
+          <w:sz w:val="17"/>
+          <w:szCs w:val="17"/>
+        </w:rPr>
+        <w:t xml:space="preserve">  HasDatadogForwarderTopicArn: !Not [!Equals [!Ref DatadogForwarderTopicArn, ""]]</w:t>
+      </w:r>
+    </w:p>
+    <w:p>
+      <w:pPr>
+        <w:shd w:fill="F2F2F2" w:color="auto" w:val="clear"/>
+        <w:spacing w:after="0" w:before="0" w:line="240"/>
+      </w:pPr>
+      <w:r>
+        <w:rPr>
+          <w:rFonts w:ascii="Consolas" w:cs="Consolas" w:eastAsia="Consolas" w:hAnsi="Consolas"/>
+          <w:sz w:val="17"/>
+          <w:szCs w:val="17"/>
+        </w:rPr>
+        <w:t xml:space="preserve"> </w:t>
+      </w:r>
+    </w:p>
+    <w:p>
+      <w:pPr>
+        <w:shd w:fill="F2F2F2" w:color="auto" w:val="clear"/>
+        <w:spacing w:after="0" w:before="0" w:line="240"/>
+      </w:pPr>
+      <w:r>
+        <w:rPr>
+          <w:rFonts w:ascii="Consolas" w:cs="Consolas" w:eastAsia="Consolas" w:hAnsi="Consolas"/>
+          <w:sz w:val="17"/>
+          <w:szCs w:val="17"/>
+        </w:rPr>
+        <w:t xml:space="preserve">Resources:</w:t>
+      </w:r>
+    </w:p>
+    <w:p>
+      <w:pPr>
+        <w:shd w:fill="F2F2F2" w:color="auto" w:val="clear"/>
+        <w:spacing w:after="0" w:before="0" w:line="240"/>
+      </w:pPr>
+      <w:r>
+        <w:rPr>
+          <w:rFonts w:ascii="Consolas" w:cs="Consolas" w:eastAsia="Consolas" w:hAnsi="Consolas"/>
+          <w:sz w:val="17"/>
+          <w:szCs w:val="17"/>
+        </w:rPr>
+        <w:t xml:space="preserve">  SchedulerInvokeRole:</w:t>
+      </w:r>
+    </w:p>
+    <w:p>
+      <w:pPr>
+        <w:shd w:fill="F2F2F2" w:color="auto" w:val="clear"/>
+        <w:spacing w:after="0" w:before="0" w:line="240"/>
+      </w:pPr>
+      <w:r>
+        <w:rPr>
+          <w:rFonts w:ascii="Consolas" w:cs="Consolas" w:eastAsia="Consolas" w:hAnsi="Consolas"/>
+          <w:sz w:val="17"/>
+          <w:szCs w:val="17"/>
+        </w:rPr>
+        <w:t xml:space="preserve">    Type: AWS::IAM::Role</w:t>
+      </w:r>
+    </w:p>
+    <w:p>
+      <w:pPr>
+        <w:shd w:fill="F2F2F2" w:color="auto" w:val="clear"/>
+        <w:spacing w:after="0" w:before="0" w:line="240"/>
+      </w:pPr>
+      <w:r>
+        <w:rPr>
+          <w:rFonts w:ascii="Consolas" w:cs="Consolas" w:eastAsia="Consolas" w:hAnsi="Consolas"/>
+          <w:sz w:val="17"/>
+          <w:szCs w:val="17"/>
+        </w:rPr>
+        <w:t xml:space="preserve">    Properties:</w:t>
+      </w:r>
+    </w:p>
+    <w:p>
+      <w:pPr>
+        <w:shd w:fill="F2F2F2" w:color="auto" w:val="clear"/>
+        <w:spacing w:after="0" w:before="0" w:line="240"/>
+      </w:pPr>
+      <w:r>
+        <w:rPr>
+          <w:rFonts w:ascii="Consolas" w:cs="Consolas" w:eastAsia="Consolas" w:hAnsi="Consolas"/>
+          <w:sz w:val="17"/>
+          <w:szCs w:val="17"/>
+        </w:rPr>
+        <w:t xml:space="preserve">      AssumeRolePolicyDocument:</w:t>
+      </w:r>
+    </w:p>
+    <w:p>
+      <w:pPr>
+        <w:shd w:fill="F2F2F2" w:color="auto" w:val="clear"/>
+        <w:spacing w:after="0" w:before="0" w:line="240"/>
+      </w:pPr>
+      <w:r>
+        <w:rPr>
+          <w:rFonts w:ascii="Consolas" w:cs="Consolas" w:eastAsia="Consolas" w:hAnsi="Consolas"/>
+          <w:sz w:val="17"/>
+          <w:szCs w:val="17"/>
+        </w:rPr>
+        <w:t xml:space="preserve">        Version: "2012-10-17"</w:t>
+      </w:r>
+    </w:p>
+    <w:p>
+      <w:pPr>
+        <w:shd w:fill="F2F2F2" w:color="auto" w:val="clear"/>
+        <w:spacing w:after="0" w:before="0" w:line="240"/>
+      </w:pPr>
+      <w:r>
+        <w:rPr>
+          <w:rFonts w:ascii="Consolas" w:cs="Consolas" w:eastAsia="Consolas" w:hAnsi="Consolas"/>
+          <w:sz w:val="17"/>
+          <w:szCs w:val="17"/>
+        </w:rPr>
+        <w:t xml:space="preserve">        Statement:</w:t>
+      </w:r>
+    </w:p>
+    <w:p>
+      <w:pPr>
+        <w:shd w:fill="F2F2F2" w:color="auto" w:val="clear"/>
+        <w:spacing w:after="0" w:before="0" w:line="240"/>
+      </w:pPr>
+      <w:r>
+        <w:rPr>
+          <w:rFonts w:ascii="Consolas" w:cs="Consolas" w:eastAsia="Consolas" w:hAnsi="Consolas"/>
+          <w:sz w:val="17"/>
+          <w:szCs w:val="17"/>
+        </w:rPr>
+        <w:t xml:space="preserve">          - Effect: Allow</w:t>
+      </w:r>
+    </w:p>
+    <w:p>
+      <w:pPr>
+        <w:shd w:fill="F2F2F2" w:color="auto" w:val="clear"/>
+        <w:spacing w:after="0" w:before="0" w:line="240"/>
+      </w:pPr>
+      <w:r>
+        <w:rPr>
+          <w:rFonts w:ascii="Consolas" w:cs="Consolas" w:eastAsia="Consolas" w:hAnsi="Consolas"/>
+          <w:sz w:val="17"/>
+          <w:szCs w:val="17"/>
+        </w:rPr>
+        <w:t xml:space="preserve">            Principal:</w:t>
+      </w:r>
+    </w:p>
+    <w:p>
+      <w:pPr>
+        <w:shd w:fill="F2F2F2" w:color="auto" w:val="clear"/>
+        <w:spacing w:after="0" w:before="0" w:line="240"/>
+      </w:pPr>
+      <w:r>
+        <w:rPr>
+          <w:rFonts w:ascii="Consolas" w:cs="Consolas" w:eastAsia="Consolas" w:hAnsi="Consolas"/>
+          <w:sz w:val="17"/>
+          <w:szCs w:val="17"/>
+        </w:rPr>
+        <w:t xml:space="preserve">              Service: scheduler.amazonaws.com</w:t>
+      </w:r>
+    </w:p>
+    <w:p>
+      <w:pPr>
+        <w:shd w:fill="F2F2F2" w:color="auto" w:val="clear"/>
+        <w:spacing w:after="0" w:before="0" w:line="240"/>
+      </w:pPr>
+      <w:r>
+        <w:rPr>
+          <w:rFonts w:ascii="Consolas" w:cs="Consolas" w:eastAsia="Consolas" w:hAnsi="Consolas"/>
+          <w:sz w:val="17"/>
+          <w:szCs w:val="17"/>
+        </w:rPr>
+        <w:t xml:space="preserve">            Action: sts:AssumeRole</w:t>
+      </w:r>
+    </w:p>
+    <w:p>
+      <w:pPr>
+        <w:shd w:fill="F2F2F2" w:color="auto" w:val="clear"/>
+        <w:spacing w:after="0" w:before="0" w:line="240"/>
+      </w:pPr>
+      <w:r>
+        <w:rPr>
+          <w:rFonts w:ascii="Consolas" w:cs="Consolas" w:eastAsia="Consolas" w:hAnsi="Consolas"/>
+          <w:sz w:val="17"/>
+          <w:szCs w:val="17"/>
+        </w:rPr>
+        <w:t xml:space="preserve">      Policies:</w:t>
+      </w:r>
+    </w:p>
+    <w:p>
+      <w:pPr>
+        <w:shd w:fill="F2F2F2" w:color="auto" w:val="clear"/>
+        <w:spacing w:after="0" w:before="0" w:line="240"/>
+      </w:pPr>
+      <w:r>
+        <w:rPr>
+          <w:rFonts w:ascii="Consolas" w:cs="Consolas" w:eastAsia="Consolas" w:hAnsi="Consolas"/>
+          <w:sz w:val="17"/>
+          <w:szCs w:val="17"/>
+        </w:rPr>
+        <w:t xml:space="preserve">        - PolicyName: InvokeCdrDownloaderFunction</w:t>
+      </w:r>
+    </w:p>
+    <w:p>
+      <w:pPr>
+        <w:shd w:fill="F2F2F2" w:color="auto" w:val="clear"/>
+        <w:spacing w:after="0" w:before="0" w:line="240"/>
+      </w:pPr>
+      <w:r>
+        <w:rPr>
+          <w:rFonts w:ascii="Consolas" w:cs="Consolas" w:eastAsia="Consolas" w:hAnsi="Consolas"/>
+          <w:sz w:val="17"/>
+          <w:szCs w:val="17"/>
+        </w:rPr>
+        <w:t xml:space="preserve">          PolicyDocument:</w:t>
+      </w:r>
+    </w:p>
+    <w:p>
+      <w:pPr>
+        <w:shd w:fill="F2F2F2" w:color="auto" w:val="clear"/>
+        <w:spacing w:after="0" w:before="0" w:line="240"/>
+      </w:pPr>
+      <w:r>
+        <w:rPr>
+          <w:rFonts w:ascii="Consolas" w:cs="Consolas" w:eastAsia="Consolas" w:hAnsi="Consolas"/>
+          <w:sz w:val="17"/>
+          <w:szCs w:val="17"/>
+        </w:rPr>
+        <w:t xml:space="preserve">            Version: "2012-10-17"</w:t>
+      </w:r>
+    </w:p>
+    <w:p>
+      <w:pPr>
+        <w:shd w:fill="F2F2F2" w:color="auto" w:val="clear"/>
+        <w:spacing w:after="0" w:before="0" w:line="240"/>
+      </w:pPr>
+      <w:r>
+        <w:rPr>
+          <w:rFonts w:ascii="Consolas" w:cs="Consolas" w:eastAsia="Consolas" w:hAnsi="Consolas"/>
+          <w:sz w:val="17"/>
+          <w:szCs w:val="17"/>
+        </w:rPr>
+        <w:t xml:space="preserve">            Statement:</w:t>
+      </w:r>
+    </w:p>
+    <w:p>
+      <w:pPr>
+        <w:shd w:fill="F2F2F2" w:color="auto" w:val="clear"/>
+        <w:spacing w:after="0" w:before="0" w:line="240"/>
+      </w:pPr>
+      <w:r>
+        <w:rPr>
+          <w:rFonts w:ascii="Consolas" w:cs="Consolas" w:eastAsia="Consolas" w:hAnsi="Consolas"/>
+          <w:sz w:val="17"/>
+          <w:szCs w:val="17"/>
+        </w:rPr>
+        <w:t xml:space="preserve">              - Effect: Allow</w:t>
+      </w:r>
+    </w:p>
+    <w:p>
+      <w:pPr>
+        <w:shd w:fill="F2F2F2" w:color="auto" w:val="clear"/>
+        <w:spacing w:after="0" w:before="0" w:line="240"/>
+      </w:pPr>
+      <w:r>
+        <w:rPr>
+          <w:rFonts w:ascii="Consolas" w:cs="Consolas" w:eastAsia="Consolas" w:hAnsi="Consolas"/>
+          <w:sz w:val="17"/>
+          <w:szCs w:val="17"/>
+        </w:rPr>
+        <w:t xml:space="preserve">                Action: lambda:InvokeFunction</w:t>
+      </w:r>
+    </w:p>
+    <w:p>
+      <w:pPr>
+        <w:shd w:fill="F2F2F2" w:color="auto" w:val="clear"/>
+        <w:spacing w:after="0" w:before="0" w:line="240"/>
+      </w:pPr>
+      <w:r>
+        <w:rPr>
+          <w:rFonts w:ascii="Consolas" w:cs="Consolas" w:eastAsia="Consolas" w:hAnsi="Consolas"/>
+          <w:sz w:val="17"/>
+          <w:szCs w:val="17"/>
+        </w:rPr>
+        <w:t xml:space="preserve">                Resource: !GetAtt CdrDownloaderFunction.Arn</w:t>
+      </w:r>
+    </w:p>
+    <w:p>
+      <w:pPr>
+        <w:shd w:fill="F2F2F2" w:color="auto" w:val="clear"/>
+        <w:spacing w:after="0" w:before="0" w:line="240"/>
+      </w:pPr>
+      <w:r>
+        <w:rPr>
+          <w:rFonts w:ascii="Consolas" w:cs="Consolas" w:eastAsia="Consolas" w:hAnsi="Consolas"/>
+          <w:sz w:val="17"/>
+          <w:szCs w:val="17"/>
+        </w:rPr>
+        <w:t xml:space="preserve"> </w:t>
+      </w:r>
+    </w:p>
+    <w:p>
+      <w:pPr>
+        <w:shd w:fill="F2F2F2" w:color="auto" w:val="clear"/>
+        <w:spacing w:after="0" w:before="0" w:line="240"/>
+      </w:pPr>
+      <w:r>
+        <w:rPr>
+          <w:rFonts w:ascii="Consolas" w:cs="Consolas" w:eastAsia="Consolas" w:hAnsi="Consolas"/>
+          <w:sz w:val="17"/>
+          <w:szCs w:val="17"/>
+        </w:rPr>
+        <w:t xml:space="preserve">  MonthlyCdrDownloadSchedule:</w:t>
+      </w:r>
+    </w:p>
+    <w:p>
+      <w:pPr>
+        <w:shd w:fill="F2F2F2" w:color="auto" w:val="clear"/>
+        <w:spacing w:after="0" w:before="0" w:line="240"/>
+      </w:pPr>
+      <w:r>
+        <w:rPr>
+          <w:rFonts w:ascii="Consolas" w:cs="Consolas" w:eastAsia="Consolas" w:hAnsi="Consolas"/>
+          <w:sz w:val="17"/>
+          <w:szCs w:val="17"/>
+        </w:rPr>
+        <w:t xml:space="preserve">    Type: AWS::Scheduler::Schedule</w:t>
+      </w:r>
+    </w:p>
+    <w:p>
+      <w:pPr>
+        <w:shd w:fill="F2F2F2" w:color="auto" w:val="clear"/>
+        <w:spacing w:after="0" w:before="0" w:line="240"/>
+      </w:pPr>
+      <w:r>
+        <w:rPr>
+          <w:rFonts w:ascii="Consolas" w:cs="Consolas" w:eastAsia="Consolas" w:hAnsi="Consolas"/>
+          <w:sz w:val="17"/>
+          <w:szCs w:val="17"/>
+        </w:rPr>
+        <w:t xml:space="preserve">    Properties:</w:t>
+      </w:r>
+    </w:p>
+    <w:p>
+      <w:pPr>
+        <w:shd w:fill="F2F2F2" w:color="auto" w:val="clear"/>
+        <w:spacing w:after="0" w:before="0" w:line="240"/>
+      </w:pPr>
+      <w:r>
+        <w:rPr>
+          <w:rFonts w:ascii="Consolas" w:cs="Consolas" w:eastAsia="Consolas" w:hAnsi="Consolas"/>
+          <w:sz w:val="17"/>
+          <w:szCs w:val="17"/>
+        </w:rPr>
+        <w:t xml:space="preserve">      Name: !Sub "${AWS::StackName}-monthly-cdr-download"</w:t>
+      </w:r>
+    </w:p>
+    <w:p>
+      <w:pPr>
+        <w:shd w:fill="F2F2F2" w:color="auto" w:val="clear"/>
+        <w:spacing w:after="0" w:before="0" w:line="240"/>
+      </w:pPr>
+      <w:r>
+        <w:rPr>
+          <w:rFonts w:ascii="Consolas" w:cs="Consolas" w:eastAsia="Consolas" w:hAnsi="Consolas"/>
+          <w:sz w:val="17"/>
+          <w:szCs w:val="17"/>
+        </w:rPr>
+        <w:t xml:space="preserve">      ScheduleExpression: !Ref ScheduleExpression</w:t>
+      </w:r>
+    </w:p>
+    <w:p>
+      <w:pPr>
+        <w:shd w:fill="F2F2F2" w:color="auto" w:val="clear"/>
+        <w:spacing w:after="0" w:before="0" w:line="240"/>
+      </w:pPr>
+      <w:r>
+        <w:rPr>
+          <w:rFonts w:ascii="Consolas" w:cs="Consolas" w:eastAsia="Consolas" w:hAnsi="Consolas"/>
+          <w:sz w:val="17"/>
+          <w:szCs w:val="17"/>
+        </w:rPr>
+        <w:t xml:space="preserve">      ScheduleExpressionTimezone: !Ref ScheduleTimezone</w:t>
+      </w:r>
+    </w:p>
+    <w:p>
+      <w:pPr>
+        <w:shd w:fill="F2F2F2" w:color="auto" w:val="clear"/>
+        <w:spacing w:after="0" w:before="0" w:line="240"/>
+      </w:pPr>
+      <w:r>
+        <w:rPr>
+          <w:rFonts w:ascii="Consolas" w:cs="Consolas" w:eastAsia="Consolas" w:hAnsi="Consolas"/>
+          <w:sz w:val="17"/>
+          <w:szCs w:val="17"/>
+        </w:rPr>
+        <w:t xml:space="preserve">      FlexibleTimeWindow:</w:t>
+      </w:r>
+    </w:p>
+    <w:p>
+      <w:pPr>
+        <w:shd w:fill="F2F2F2" w:color="auto" w:val="clear"/>
+        <w:spacing w:after="0" w:before="0" w:line="240"/>
+      </w:pPr>
+      <w:r>
+        <w:rPr>
+          <w:rFonts w:ascii="Consolas" w:cs="Consolas" w:eastAsia="Consolas" w:hAnsi="Consolas"/>
+          <w:sz w:val="17"/>
+          <w:szCs w:val="17"/>
+        </w:rPr>
+        <w:t xml:space="preserve">        Mode: "OFF"</w:t>
+      </w:r>
+    </w:p>
+    <w:p>
+      <w:pPr>
+        <w:shd w:fill="F2F2F2" w:color="auto" w:val="clear"/>
+        <w:spacing w:after="0" w:before="0" w:line="240"/>
+      </w:pPr>
+      <w:r>
+        <w:rPr>
+          <w:rFonts w:ascii="Consolas" w:cs="Consolas" w:eastAsia="Consolas" w:hAnsi="Consolas"/>
+          <w:sz w:val="17"/>
+          <w:szCs w:val="17"/>
+        </w:rPr>
+        <w:t xml:space="preserve">      State: ENABLED</w:t>
+      </w:r>
+    </w:p>
+    <w:p>
+      <w:pPr>
+        <w:shd w:fill="F2F2F2" w:color="auto" w:val="clear"/>
+        <w:spacing w:after="0" w:before="0" w:line="240"/>
+      </w:pPr>
+      <w:r>
+        <w:rPr>
+          <w:rFonts w:ascii="Consolas" w:cs="Consolas" w:eastAsia="Consolas" w:hAnsi="Consolas"/>
+          <w:sz w:val="17"/>
+          <w:szCs w:val="17"/>
+        </w:rPr>
+        <w:t xml:space="preserve">      Target:</w:t>
+      </w:r>
+    </w:p>
+    <w:p>
+      <w:pPr>
+        <w:shd w:fill="F2F2F2" w:color="auto" w:val="clear"/>
+        <w:spacing w:after="0" w:before="0" w:line="240"/>
+      </w:pPr>
+      <w:r>
+        <w:rPr>
+          <w:rFonts w:ascii="Consolas" w:cs="Consolas" w:eastAsia="Consolas" w:hAnsi="Consolas"/>
+          <w:sz w:val="17"/>
+          <w:szCs w:val="17"/>
+        </w:rPr>
+        <w:t xml:space="preserve">        Arn: !GetAtt CdrDownloaderFunction.Arn</w:t>
       </w:r>
     </w:p>
     <w:p>
@@ -1722,7 +2378,7 @@
           <w:sz w:val="17"/>
           <w:szCs w:val="17"/>
         </w:rPr>
-        <w:t xml:space="preserve">      - !Ref DatadogForwarderTopicArn</w:t>
+        <w:t xml:space="preserve">        RoleArn: !GetAtt SchedulerInvokeRole.Arn</w:t>
       </w:r>
     </w:p>
     <w:p>
@@ -1731,7 +2387,7 @@
         <w:spacing w:after="120" w:before="240"/>
       </w:pPr>
       <w:r>
-        <w:t xml:space="preserve">1.4 Effective IAM permissions</w:t>
+        <w:t xml:space="preserve">1.4 CloudWatch alarm (optional Datadog alerting, updated in v1.5)</w:t>
       </w:r>
     </w:p>
     <w:p>
@@ -1743,42 +2399,7 @@
           <w:sz w:val="22"/>
           <w:szCs w:val="22"/>
         </w:rPr>
-        <w:t xml:space="preserve">s3:PutObject scoped to exactly the cdr/* and debug/* prefixes of CdrBucket (not the bucket as a whole — the only action and prefixes the code ever uses); secretsmanager:GetSecretValue scoped to the named secret's ARN pattern; plus the default Lambda basic execution policy (CloudWatch Logs write) SAM always attaches. No broader S3 or Secrets Manager access is granted.</w:t>
-      </w:r>
-    </w:p>
-    <w:p>
-      <w:pPr>
-        <w:pStyle w:val="Heading2"/>
-        <w:spacing w:after="120" w:before="240"/>
-      </w:pPr>
-      <w:r>
-        <w:t xml:space="preserve">1.5 CDR record freshness check (new in v1.1)</w:t>
-      </w:r>
-    </w:p>
-    <w:p>
-      <w:pPr>
-        <w:spacing w:after="200" w:before="0"/>
-      </w:pPr>
-      <w:r>
-        <w:rPr>
-          <w:sz w:val="22"/>
-          <w:szCs w:val="22"/>
-        </w:rPr>
-        <w:t xml:space="preserve">On the 1st of the month (UTC), verifyLatestRecordIsAvailable() in src/index.js reads the newest SDR row's End Date and confirms it equals the last calendar day of the previous month — the period that should have just completed. If Gradwell hasn't published that period yet (the newest row is still last month's), the function throws instead of silently downloading and storing a stale file under the new month's S3 key. That throw is logged to CloudWatch Logs like any other error and trips CdrDownloaderErrorsAlarm, which — once the Datadog Forwarder topic ARN is populated — surfaces as a Datadog monitor event. This check is a no-op on every other day of the month, so manual test invokes are unaffected.</w:t>
-      </w:r>
-    </w:p>
-    <w:p>
-      <w:r>
-        <w:br w:type="page"/>
-      </w:r>
-    </w:p>
-    <w:p>
-      <w:pPr>
-        <w:pStyle w:val="Heading1"/>
-        <w:spacing w:after="120" w:before="240"/>
-      </w:pPr>
-      <w:r>
-        <w:t xml:space="preserve">2. Node.js Dependencies (package.json)</w:t>
+        <w:t xml:space="preserve">DatadogForwarderTopicArn now defaults to an empty string. The HasDatadogForwarderTopicArn condition gates the alarm's AlarmActions/OKActions on it being non-empty, so the stack — and the alarm itself — deploy and function fine before a Datadog Forwarder exists; the alarm just has no external notification target until the real SNS topic ARN is supplied via --parameter-overrides.</w:t>
       </w:r>
     </w:p>
     <w:p>
@@ -1795,105 +2416,217 @@
           <w:sz w:val="17"/>
           <w:szCs w:val="17"/>
         </w:rPr>
-        <w:t xml:space="preserve">{</w:t>
-      </w:r>
-    </w:p>
-    <w:p>
-      <w:pPr>
-        <w:shd w:fill="F2F2F2" w:color="auto" w:val="clear"/>
-        <w:spacing w:after="0" w:before="0" w:line="240"/>
-      </w:pPr>
-      <w:r>
-        <w:rPr>
-          <w:rFonts w:ascii="Consolas" w:cs="Consolas" w:eastAsia="Consolas" w:hAnsi="Consolas"/>
-          <w:sz w:val="17"/>
-          <w:szCs w:val="17"/>
-        </w:rPr>
-        <w:t xml:space="preserve">  "engines": { "node": "&gt;=20" },</w:t>
-      </w:r>
-    </w:p>
-    <w:p>
-      <w:pPr>
-        <w:shd w:fill="F2F2F2" w:color="auto" w:val="clear"/>
-        <w:spacing w:after="0" w:before="0" w:line="240"/>
-      </w:pPr>
-      <w:r>
-        <w:rPr>
-          <w:rFonts w:ascii="Consolas" w:cs="Consolas" w:eastAsia="Consolas" w:hAnsi="Consolas"/>
-          <w:sz w:val="17"/>
-          <w:szCs w:val="17"/>
-        </w:rPr>
-        <w:t xml:space="preserve">  "dependencies": {</w:t>
-      </w:r>
-    </w:p>
-    <w:p>
-      <w:pPr>
-        <w:shd w:fill="F2F2F2" w:color="auto" w:val="clear"/>
-        <w:spacing w:after="0" w:before="0" w:line="240"/>
-      </w:pPr>
-      <w:r>
-        <w:rPr>
-          <w:rFonts w:ascii="Consolas" w:cs="Consolas" w:eastAsia="Consolas" w:hAnsi="Consolas"/>
-          <w:sz w:val="17"/>
-          <w:szCs w:val="17"/>
-        </w:rPr>
-        <w:t xml:space="preserve">    "@aws-sdk/client-s3": "^3.700.0",</w:t>
-      </w:r>
-    </w:p>
-    <w:p>
-      <w:pPr>
-        <w:shd w:fill="F2F2F2" w:color="auto" w:val="clear"/>
-        <w:spacing w:after="0" w:before="0" w:line="240"/>
-      </w:pPr>
-      <w:r>
-        <w:rPr>
-          <w:rFonts w:ascii="Consolas" w:cs="Consolas" w:eastAsia="Consolas" w:hAnsi="Consolas"/>
-          <w:sz w:val="17"/>
-          <w:szCs w:val="17"/>
-        </w:rPr>
-        <w:t xml:space="preserve">    "@aws-sdk/client-secrets-manager": "^3.700.0",</w:t>
-      </w:r>
-    </w:p>
-    <w:p>
-      <w:pPr>
-        <w:shd w:fill="F2F2F2" w:color="auto" w:val="clear"/>
-        <w:spacing w:after="0" w:before="0" w:line="240"/>
-      </w:pPr>
-      <w:r>
-        <w:rPr>
-          <w:rFonts w:ascii="Consolas" w:cs="Consolas" w:eastAsia="Consolas" w:hAnsi="Consolas"/>
-          <w:sz w:val="17"/>
-          <w:szCs w:val="17"/>
-        </w:rPr>
-        <w:t xml:space="preserve">    "@sparticuz/chromium": "^153.0.0",</w:t>
-      </w:r>
-    </w:p>
-    <w:p>
-      <w:pPr>
-        <w:shd w:fill="F2F2F2" w:color="auto" w:val="clear"/>
-        <w:spacing w:after="0" w:before="0" w:line="240"/>
-      </w:pPr>
-      <w:r>
-        <w:rPr>
-          <w:rFonts w:ascii="Consolas" w:cs="Consolas" w:eastAsia="Consolas" w:hAnsi="Consolas"/>
-          <w:sz w:val="17"/>
-          <w:szCs w:val="17"/>
-        </w:rPr>
-        <w:t xml:space="preserve">    "playwright-core": "^1.63.0"</w:t>
-      </w:r>
-    </w:p>
-    <w:p>
-      <w:pPr>
-        <w:shd w:fill="F2F2F2" w:color="auto" w:val="clear"/>
-        <w:spacing w:after="0" w:before="0" w:line="240"/>
-      </w:pPr>
-      <w:r>
-        <w:rPr>
-          <w:rFonts w:ascii="Consolas" w:cs="Consolas" w:eastAsia="Consolas" w:hAnsi="Consolas"/>
-          <w:sz w:val="17"/>
-          <w:szCs w:val="17"/>
-        </w:rPr>
-        <w:t xml:space="preserve">  }</w:t>
+        <w:t xml:space="preserve">CdrDownloaderErrorsAlarm:</w:t>
+      </w:r>
+    </w:p>
+    <w:p>
+      <w:pPr>
+        <w:shd w:fill="F2F2F2" w:color="auto" w:val="clear"/>
+        <w:spacing w:after="0" w:before="0" w:line="240"/>
+      </w:pPr>
+      <w:r>
+        <w:rPr>
+          <w:rFonts w:ascii="Consolas" w:cs="Consolas" w:eastAsia="Consolas" w:hAnsi="Consolas"/>
+          <w:sz w:val="17"/>
+          <w:szCs w:val="17"/>
+        </w:rPr>
+        <w:t xml:space="preserve">  Type: AWS::CloudWatch::Alarm</w:t>
+      </w:r>
+    </w:p>
+    <w:p>
+      <w:pPr>
+        <w:shd w:fill="F2F2F2" w:color="auto" w:val="clear"/>
+        <w:spacing w:after="0" w:before="0" w:line="240"/>
+      </w:pPr>
+      <w:r>
+        <w:rPr>
+          <w:rFonts w:ascii="Consolas" w:cs="Consolas" w:eastAsia="Consolas" w:hAnsi="Consolas"/>
+          <w:sz w:val="17"/>
+          <w:szCs w:val="17"/>
+        </w:rPr>
+        <w:t xml:space="preserve">  Properties:</w:t>
+      </w:r>
+    </w:p>
+    <w:p>
+      <w:pPr>
+        <w:shd w:fill="F2F2F2" w:color="auto" w:val="clear"/>
+        <w:spacing w:after="0" w:before="0" w:line="240"/>
+      </w:pPr>
+      <w:r>
+        <w:rPr>
+          <w:rFonts w:ascii="Consolas" w:cs="Consolas" w:eastAsia="Consolas" w:hAnsi="Consolas"/>
+          <w:sz w:val="17"/>
+          <w:szCs w:val="17"/>
+        </w:rPr>
+        <w:t xml:space="preserve">    AlarmName: !Sub "${AWS::StackName}-lambda-errors"</w:t>
+      </w:r>
+    </w:p>
+    <w:p>
+      <w:pPr>
+        <w:shd w:fill="F2F2F2" w:color="auto" w:val="clear"/>
+        <w:spacing w:after="0" w:before="0" w:line="240"/>
+      </w:pPr>
+      <w:r>
+        <w:rPr>
+          <w:rFonts w:ascii="Consolas" w:cs="Consolas" w:eastAsia="Consolas" w:hAnsi="Consolas"/>
+          <w:sz w:val="17"/>
+          <w:szCs w:val="17"/>
+        </w:rPr>
+        <w:t xml:space="preserve">    Namespace: AWS/Lambda</w:t>
+      </w:r>
+    </w:p>
+    <w:p>
+      <w:pPr>
+        <w:shd w:fill="F2F2F2" w:color="auto" w:val="clear"/>
+        <w:spacing w:after="0" w:before="0" w:line="240"/>
+      </w:pPr>
+      <w:r>
+        <w:rPr>
+          <w:rFonts w:ascii="Consolas" w:cs="Consolas" w:eastAsia="Consolas" w:hAnsi="Consolas"/>
+          <w:sz w:val="17"/>
+          <w:szCs w:val="17"/>
+        </w:rPr>
+        <w:t xml:space="preserve">    MetricName: Errors</w:t>
+      </w:r>
+    </w:p>
+    <w:p>
+      <w:pPr>
+        <w:shd w:fill="F2F2F2" w:color="auto" w:val="clear"/>
+        <w:spacing w:after="0" w:before="0" w:line="240"/>
+      </w:pPr>
+      <w:r>
+        <w:rPr>
+          <w:rFonts w:ascii="Consolas" w:cs="Consolas" w:eastAsia="Consolas" w:hAnsi="Consolas"/>
+          <w:sz w:val="17"/>
+          <w:szCs w:val="17"/>
+        </w:rPr>
+        <w:t xml:space="preserve">    Dimensions:</w:t>
+      </w:r>
+    </w:p>
+    <w:p>
+      <w:pPr>
+        <w:shd w:fill="F2F2F2" w:color="auto" w:val="clear"/>
+        <w:spacing w:after="0" w:before="0" w:line="240"/>
+      </w:pPr>
+      <w:r>
+        <w:rPr>
+          <w:rFonts w:ascii="Consolas" w:cs="Consolas" w:eastAsia="Consolas" w:hAnsi="Consolas"/>
+          <w:sz w:val="17"/>
+          <w:szCs w:val="17"/>
+        </w:rPr>
+        <w:t xml:space="preserve">      - Name: FunctionName</w:t>
+      </w:r>
+    </w:p>
+    <w:p>
+      <w:pPr>
+        <w:shd w:fill="F2F2F2" w:color="auto" w:val="clear"/>
+        <w:spacing w:after="0" w:before="0" w:line="240"/>
+      </w:pPr>
+      <w:r>
+        <w:rPr>
+          <w:rFonts w:ascii="Consolas" w:cs="Consolas" w:eastAsia="Consolas" w:hAnsi="Consolas"/>
+          <w:sz w:val="17"/>
+          <w:szCs w:val="17"/>
+        </w:rPr>
+        <w:t xml:space="preserve">        Value: !Ref CdrDownloaderFunction</w:t>
+      </w:r>
+    </w:p>
+    <w:p>
+      <w:pPr>
+        <w:shd w:fill="F2F2F2" w:color="auto" w:val="clear"/>
+        <w:spacing w:after="0" w:before="0" w:line="240"/>
+      </w:pPr>
+      <w:r>
+        <w:rPr>
+          <w:rFonts w:ascii="Consolas" w:cs="Consolas" w:eastAsia="Consolas" w:hAnsi="Consolas"/>
+          <w:sz w:val="17"/>
+          <w:szCs w:val="17"/>
+        </w:rPr>
+        <w:t xml:space="preserve">    Statistic: Sum</w:t>
+      </w:r>
+    </w:p>
+    <w:p>
+      <w:pPr>
+        <w:shd w:fill="F2F2F2" w:color="auto" w:val="clear"/>
+        <w:spacing w:after="0" w:before="0" w:line="240"/>
+      </w:pPr>
+      <w:r>
+        <w:rPr>
+          <w:rFonts w:ascii="Consolas" w:cs="Consolas" w:eastAsia="Consolas" w:hAnsi="Consolas"/>
+          <w:sz w:val="17"/>
+          <w:szCs w:val="17"/>
+        </w:rPr>
+        <w:t xml:space="preserve">    Period: 86400</w:t>
+      </w:r>
+    </w:p>
+    <w:p>
+      <w:pPr>
+        <w:shd w:fill="F2F2F2" w:color="auto" w:val="clear"/>
+        <w:spacing w:after="0" w:before="0" w:line="240"/>
+      </w:pPr>
+      <w:r>
+        <w:rPr>
+          <w:rFonts w:ascii="Consolas" w:cs="Consolas" w:eastAsia="Consolas" w:hAnsi="Consolas"/>
+          <w:sz w:val="17"/>
+          <w:szCs w:val="17"/>
+        </w:rPr>
+        <w:t xml:space="preserve">    EvaluationPeriods: 1</w:t>
+      </w:r>
+    </w:p>
+    <w:p>
+      <w:pPr>
+        <w:shd w:fill="F2F2F2" w:color="auto" w:val="clear"/>
+        <w:spacing w:after="0" w:before="0" w:line="240"/>
+      </w:pPr>
+      <w:r>
+        <w:rPr>
+          <w:rFonts w:ascii="Consolas" w:cs="Consolas" w:eastAsia="Consolas" w:hAnsi="Consolas"/>
+          <w:sz w:val="17"/>
+          <w:szCs w:val="17"/>
+        </w:rPr>
+        <w:t xml:space="preserve">    Threshold: 0</w:t>
+      </w:r>
+    </w:p>
+    <w:p>
+      <w:pPr>
+        <w:shd w:fill="F2F2F2" w:color="auto" w:val="clear"/>
+        <w:spacing w:after="0" w:before="0" w:line="240"/>
+      </w:pPr>
+      <w:r>
+        <w:rPr>
+          <w:rFonts w:ascii="Consolas" w:cs="Consolas" w:eastAsia="Consolas" w:hAnsi="Consolas"/>
+          <w:sz w:val="17"/>
+          <w:szCs w:val="17"/>
+        </w:rPr>
+        <w:t xml:space="preserve">    ComparisonOperator: GreaterThanThreshold</w:t>
+      </w:r>
+    </w:p>
+    <w:p>
+      <w:pPr>
+        <w:shd w:fill="F2F2F2" w:color="auto" w:val="clear"/>
+        <w:spacing w:after="0" w:before="0" w:line="240"/>
+      </w:pPr>
+      <w:r>
+        <w:rPr>
+          <w:rFonts w:ascii="Consolas" w:cs="Consolas" w:eastAsia="Consolas" w:hAnsi="Consolas"/>
+          <w:sz w:val="17"/>
+          <w:szCs w:val="17"/>
+        </w:rPr>
+        <w:t xml:space="preserve">    TreatMissingData: notBreaching</w:t>
+      </w:r>
+    </w:p>
+    <w:p>
+      <w:pPr>
+        <w:shd w:fill="F2F2F2" w:color="auto" w:val="clear"/>
+        <w:spacing w:after="0" w:before="0" w:line="240"/>
+      </w:pPr>
+      <w:r>
+        <w:rPr>
+          <w:rFonts w:ascii="Consolas" w:cs="Consolas" w:eastAsia="Consolas" w:hAnsi="Consolas"/>
+          <w:sz w:val="17"/>
+          <w:szCs w:val="17"/>
+        </w:rPr>
+        <w:t xml:space="preserve">    AlarmActions: !If [HasDatadogForwarderTopicArn, [!Ref DatadogForwarderTopicArn], []]</w:t>
       </w:r>
     </w:p>
     <w:p>
@@ -1910,7 +2643,70 @@
           <w:sz w:val="17"/>
           <w:szCs w:val="17"/>
         </w:rPr>
-        <w:t xml:space="preserve">}</w:t>
+        <w:t xml:space="preserve">    OKActions: !If [HasDatadogForwarderTopicArn, [!Ref DatadogForwarderTopicArn], []]</w:t>
+      </w:r>
+    </w:p>
+    <w:p>
+      <w:pPr>
+        <w:pStyle w:val="Heading2"/>
+        <w:spacing w:after="120" w:before="240"/>
+      </w:pPr>
+      <w:r>
+        <w:t xml:space="preserve">1.5 Effective IAM permissions</w:t>
+      </w:r>
+    </w:p>
+    <w:p>
+      <w:pPr>
+        <w:spacing w:after="200" w:before="0"/>
+      </w:pPr>
+      <w:r>
+        <w:rPr>
+          <w:sz w:val="22"/>
+          <w:szCs w:val="22"/>
+        </w:rPr>
+        <w:t xml:space="preserve">CdrDownloaderFunction's execution role: s3:PutObject scoped to exactly the cdr/* and debug/* prefixes of CdrBucket (not the bucket as a whole — the only action and prefixes the code ever uses); secretsmanager:GetSecretValue scoped to the named secret's ARN pattern; plus the default Lambda basic execution policy (CloudWatch Logs write) SAM always attaches. SchedulerInvokeRole is a separate role, held by EventBridge Scheduler rather than the function, scoped to lambda:InvokeFunction on only this one function's ARN. No broader S3, Secrets Manager, or Lambda access is granted anywhere in the stack.</w:t>
+      </w:r>
+    </w:p>
+    <w:p>
+      <w:pPr>
+        <w:pStyle w:val="Heading2"/>
+        <w:spacing w:after="120" w:before="240"/>
+      </w:pPr>
+      <w:r>
+        <w:t xml:space="preserve">1.6 CDR record freshness check (new in v1.1)</w:t>
+      </w:r>
+    </w:p>
+    <w:p>
+      <w:pPr>
+        <w:spacing w:after="200" w:before="0"/>
+      </w:pPr>
+      <w:r>
+        <w:rPr>
+          <w:sz w:val="22"/>
+          <w:szCs w:val="22"/>
+        </w:rPr>
+        <w:t xml:space="preserve">On the 1st of the month (UTC), verifyLatestRecordIsAvailable() in src/index.js reads the newest SDR row's End Date and confirms it equals the last calendar day of the previous month — the period that should have just completed. If Gradwell hasn't published that period yet (the newest row is still last month's), the function throws instead of silently downloading and storing a stale file under the new month's S3 key. That throw is logged to CloudWatch Logs like any other error and trips CdrDownloaderErrorsAlarm, which — once the Datadog Forwarder topic ARN is populated — surfaces as a Datadog monitor event. This check is a no-op on every other day of the month, so manual test invokes are unaffected.</w:t>
+      </w:r>
+    </w:p>
+    <w:p>
+      <w:pPr>
+        <w:pStyle w:val="Heading2"/>
+        <w:spacing w:after="120" w:before="240"/>
+      </w:pPr>
+      <w:r>
+        <w:t xml:space="preserve">1.7 Execution duration timing (new in v1.3)</w:t>
+      </w:r>
+    </w:p>
+    <w:p>
+      <w:pPr>
+        <w:spacing w:after="200" w:before="0"/>
+      </w:pPr>
+      <w:r>
+        <w:rPr>
+          <w:sz w:val="22"/>
+          <w:szCs w:val="22"/>
+        </w:rPr>
+        <w:t xml:space="preserve">The handler captures a start timestamp on entry and computes elapsed wall-clock time at both the success return and the failure log: on success the response includes durationMs alongside bucket and key (e.g. {"statusCode":200,"bucket":"...","key":"...","durationMs":18342}); on failure, the CloudWatch error log is prefixed with the elapsed time before the stack trace. This makes it straightforward to see how long a run took from a manual invoke's response alone, and to notice runs creeping toward the 180-second timeout before they start failing outright.</w:t>
       </w:r>
     </w:p>
     <w:p>
@@ -1924,16 +2720,7 @@
         <w:spacing w:after="120" w:before="240"/>
       </w:pPr>
       <w:r>
-        <w:t xml:space="preserve">3. Source Code</w:t>
-      </w:r>
-    </w:p>
-    <w:p>
-      <w:pPr>
-        <w:pStyle w:val="Heading2"/>
-        <w:spacing w:after="120" w:before="240"/>
-      </w:pPr>
-      <w:r>
-        <w:t xml:space="preserve">3.1 src/index.js — handler and browser automation</w:t>
+        <w:t xml:space="preserve">2. Node.js Dependencies (package.json)</w:t>
       </w:r>
     </w:p>
     <w:p>
@@ -1950,6 +2737,161 @@
           <w:sz w:val="17"/>
           <w:szCs w:val="17"/>
         </w:rPr>
+        <w:t xml:space="preserve">{</w:t>
+      </w:r>
+    </w:p>
+    <w:p>
+      <w:pPr>
+        <w:shd w:fill="F2F2F2" w:color="auto" w:val="clear"/>
+        <w:spacing w:after="0" w:before="0" w:line="240"/>
+      </w:pPr>
+      <w:r>
+        <w:rPr>
+          <w:rFonts w:ascii="Consolas" w:cs="Consolas" w:eastAsia="Consolas" w:hAnsi="Consolas"/>
+          <w:sz w:val="17"/>
+          <w:szCs w:val="17"/>
+        </w:rPr>
+        <w:t xml:space="preserve">  "engines": { "node": "&gt;=20" },</w:t>
+      </w:r>
+    </w:p>
+    <w:p>
+      <w:pPr>
+        <w:shd w:fill="F2F2F2" w:color="auto" w:val="clear"/>
+        <w:spacing w:after="0" w:before="0" w:line="240"/>
+      </w:pPr>
+      <w:r>
+        <w:rPr>
+          <w:rFonts w:ascii="Consolas" w:cs="Consolas" w:eastAsia="Consolas" w:hAnsi="Consolas"/>
+          <w:sz w:val="17"/>
+          <w:szCs w:val="17"/>
+        </w:rPr>
+        <w:t xml:space="preserve">  "dependencies": {</w:t>
+      </w:r>
+    </w:p>
+    <w:p>
+      <w:pPr>
+        <w:shd w:fill="F2F2F2" w:color="auto" w:val="clear"/>
+        <w:spacing w:after="0" w:before="0" w:line="240"/>
+      </w:pPr>
+      <w:r>
+        <w:rPr>
+          <w:rFonts w:ascii="Consolas" w:cs="Consolas" w:eastAsia="Consolas" w:hAnsi="Consolas"/>
+          <w:sz w:val="17"/>
+          <w:szCs w:val="17"/>
+        </w:rPr>
+        <w:t xml:space="preserve">    "@aws-sdk/client-s3": "^3.700.0",</w:t>
+      </w:r>
+    </w:p>
+    <w:p>
+      <w:pPr>
+        <w:shd w:fill="F2F2F2" w:color="auto" w:val="clear"/>
+        <w:spacing w:after="0" w:before="0" w:line="240"/>
+      </w:pPr>
+      <w:r>
+        <w:rPr>
+          <w:rFonts w:ascii="Consolas" w:cs="Consolas" w:eastAsia="Consolas" w:hAnsi="Consolas"/>
+          <w:sz w:val="17"/>
+          <w:szCs w:val="17"/>
+        </w:rPr>
+        <w:t xml:space="preserve">    "@aws-sdk/client-secrets-manager": "^3.700.0",</w:t>
+      </w:r>
+    </w:p>
+    <w:p>
+      <w:pPr>
+        <w:shd w:fill="F2F2F2" w:color="auto" w:val="clear"/>
+        <w:spacing w:after="0" w:before="0" w:line="240"/>
+      </w:pPr>
+      <w:r>
+        <w:rPr>
+          <w:rFonts w:ascii="Consolas" w:cs="Consolas" w:eastAsia="Consolas" w:hAnsi="Consolas"/>
+          <w:sz w:val="17"/>
+          <w:szCs w:val="17"/>
+        </w:rPr>
+        <w:t xml:space="preserve">    "@sparticuz/chromium": "^153.0.0",</w:t>
+      </w:r>
+    </w:p>
+    <w:p>
+      <w:pPr>
+        <w:shd w:fill="F2F2F2" w:color="auto" w:val="clear"/>
+        <w:spacing w:after="0" w:before="0" w:line="240"/>
+      </w:pPr>
+      <w:r>
+        <w:rPr>
+          <w:rFonts w:ascii="Consolas" w:cs="Consolas" w:eastAsia="Consolas" w:hAnsi="Consolas"/>
+          <w:sz w:val="17"/>
+          <w:szCs w:val="17"/>
+        </w:rPr>
+        <w:t xml:space="preserve">    "playwright-core": "^1.63.0"</w:t>
+      </w:r>
+    </w:p>
+    <w:p>
+      <w:pPr>
+        <w:shd w:fill="F2F2F2" w:color="auto" w:val="clear"/>
+        <w:spacing w:after="0" w:before="0" w:line="240"/>
+      </w:pPr>
+      <w:r>
+        <w:rPr>
+          <w:rFonts w:ascii="Consolas" w:cs="Consolas" w:eastAsia="Consolas" w:hAnsi="Consolas"/>
+          <w:sz w:val="17"/>
+          <w:szCs w:val="17"/>
+        </w:rPr>
+        <w:t xml:space="preserve">  }</w:t>
+      </w:r>
+    </w:p>
+    <w:p>
+      <w:pPr>
+        <w:pBdr>
+          <w:bottom w:val="single" w:color="CCCCCC" w:sz="4"/>
+        </w:pBdr>
+        <w:shd w:fill="F2F2F2" w:color="auto" w:val="clear"/>
+        <w:spacing w:after="0" w:before="0" w:line="240"/>
+      </w:pPr>
+      <w:r>
+        <w:rPr>
+          <w:rFonts w:ascii="Consolas" w:cs="Consolas" w:eastAsia="Consolas" w:hAnsi="Consolas"/>
+          <w:sz w:val="17"/>
+          <w:szCs w:val="17"/>
+        </w:rPr>
+        <w:t xml:space="preserve">}</w:t>
+      </w:r>
+    </w:p>
+    <w:p>
+      <w:r>
+        <w:br w:type="page"/>
+      </w:r>
+    </w:p>
+    <w:p>
+      <w:pPr>
+        <w:pStyle w:val="Heading1"/>
+        <w:spacing w:after="120" w:before="240"/>
+      </w:pPr>
+      <w:r>
+        <w:t xml:space="preserve">3. Source Code</w:t>
+      </w:r>
+    </w:p>
+    <w:p>
+      <w:pPr>
+        <w:pStyle w:val="Heading2"/>
+        <w:spacing w:after="120" w:before="240"/>
+      </w:pPr>
+      <w:r>
+        <w:t xml:space="preserve">3.1 src/index.js — handler and browser automation</w:t>
+      </w:r>
+    </w:p>
+    <w:p>
+      <w:pPr>
+        <w:pBdr>
+          <w:top w:val="single" w:color="CCCCCC" w:sz="4"/>
+        </w:pBdr>
+        <w:shd w:fill="F2F2F2" w:color="auto" w:val="clear"/>
+        <w:spacing w:after="0" w:before="0" w:line="240"/>
+      </w:pPr>
+      <w:r>
+        <w:rPr>
+          <w:rFonts w:ascii="Consolas" w:cs="Consolas" w:eastAsia="Consolas" w:hAnsi="Consolas"/>
+          <w:sz w:val="17"/>
+          <w:szCs w:val="17"/>
+        </w:rPr>
         <w:t xml:space="preserve">"use strict";</w:t>
       </w:r>
     </w:p>
@@ -4372,6 +5314,20 @@
           <w:sz w:val="17"/>
           <w:szCs w:val="17"/>
         </w:rPr>
+        <w:t xml:space="preserve">  const startedAt = Date.now();</w:t>
+      </w:r>
+    </w:p>
+    <w:p>
+      <w:pPr>
+        <w:shd w:fill="F2F2F2" w:color="auto" w:val="clear"/>
+        <w:spacing w:after="0" w:before="0" w:line="240"/>
+      </w:pPr>
+      <w:r>
+        <w:rPr>
+          <w:rFonts w:ascii="Consolas" w:cs="Consolas" w:eastAsia="Consolas" w:hAnsi="Consolas"/>
+          <w:sz w:val="17"/>
+          <w:szCs w:val="17"/>
+        </w:rPr>
         <w:t xml:space="preserve">  const bucket = requireEnv("CDR_BUCKET_NAME");</w:t>
       </w:r>
     </w:p>
@@ -4918,21 +5874,35 @@
           <w:sz w:val="17"/>
           <w:szCs w:val="17"/>
         </w:rPr>
-        <w:t xml:space="preserve">    console.log(`CDR file uploaded to s3://${bucket}/${key}`);</w:t>
-      </w:r>
-    </w:p>
-    <w:p>
-      <w:pPr>
-        <w:shd w:fill="F2F2F2" w:color="auto" w:val="clear"/>
-        <w:spacing w:after="0" w:before="0" w:line="240"/>
-      </w:pPr>
-      <w:r>
-        <w:rPr>
-          <w:rFonts w:ascii="Consolas" w:cs="Consolas" w:eastAsia="Consolas" w:hAnsi="Consolas"/>
-          <w:sz w:val="17"/>
-          <w:szCs w:val="17"/>
-        </w:rPr>
-        <w:t xml:space="preserve">    return { statusCode: 200, bucket, key };</w:t>
+        <w:t xml:space="preserve">    const durationMs = Date.now() - startedAt;</w:t>
+      </w:r>
+    </w:p>
+    <w:p>
+      <w:pPr>
+        <w:shd w:fill="F2F2F2" w:color="auto" w:val="clear"/>
+        <w:spacing w:after="0" w:before="0" w:line="240"/>
+      </w:pPr>
+      <w:r>
+        <w:rPr>
+          <w:rFonts w:ascii="Consolas" w:cs="Consolas" w:eastAsia="Consolas" w:hAnsi="Consolas"/>
+          <w:sz w:val="17"/>
+          <w:szCs w:val="17"/>
+        </w:rPr>
+        <w:t xml:space="preserve">    console.log(`CDR file uploaded to s3://${bucket}/${key} in ${durationMs}ms`);</w:t>
+      </w:r>
+    </w:p>
+    <w:p>
+      <w:pPr>
+        <w:shd w:fill="F2F2F2" w:color="auto" w:val="clear"/>
+        <w:spacing w:after="0" w:before="0" w:line="240"/>
+      </w:pPr>
+      <w:r>
+        <w:rPr>
+          <w:rFonts w:ascii="Consolas" w:cs="Consolas" w:eastAsia="Consolas" w:hAnsi="Consolas"/>
+          <w:sz w:val="17"/>
+          <w:szCs w:val="17"/>
+        </w:rPr>
+        <w:t xml:space="preserve">    return { statusCode: 200, bucket, key, durationMs };</w:t>
       </w:r>
     </w:p>
     <w:p>
@@ -4960,7 +5930,21 @@
           <w:sz w:val="17"/>
           <w:szCs w:val="17"/>
         </w:rPr>
-        <w:t xml:space="preserve">    console.error("CDR download automation failed:", err);</w:t>
+        <w:t xml:space="preserve">    const durationMs = Date.now() - startedAt;</w:t>
+      </w:r>
+    </w:p>
+    <w:p>
+      <w:pPr>
+        <w:shd w:fill="F2F2F2" w:color="auto" w:val="clear"/>
+        <w:spacing w:after="0" w:before="0" w:line="240"/>
+      </w:pPr>
+      <w:r>
+        <w:rPr>
+          <w:rFonts w:ascii="Consolas" w:cs="Consolas" w:eastAsia="Consolas" w:hAnsi="Consolas"/>
+          <w:sz w:val="17"/>
+          <w:szCs w:val="17"/>
+        </w:rPr>
+        <w:t xml:space="preserve">    console.error(`CDR download automation failed after ${durationMs}ms:`, err);</w:t>
       </w:r>
     </w:p>
     <w:p>

</xml_diff>